<commit_message>
cambios en el parser a nivel front xml jats
</commit_message>
<xml_diff>
--- a/documentacion dia 26-8-2026.docx
+++ b/documentacion dia 26-8-2026.docx
@@ -91,14 +91,87 @@
         <w:pBdr/>
         <w:spacing/>
         <w:ind/>
-        <w:rPr/>
+        <w:rPr>
+          <w:highlight w:val="none"/>
+        </w:rPr>
       </w:pPr>
       <w:r>
         <w:t xml:space="preserve">8. Consolidación de la arquitectura de servicios JATS para publicaciones científicas bajo especificaciones NLM.</w:t>
       </w:r>
       <w:r/>
+    </w:p>
+    <w:p>
+      <w:pPr>
+        <w:pBdr/>
+        <w:spacing/>
+        <w:ind/>
+        <w:rPr/>
+      </w:pPr>
       <w:r/>
       <w:r/>
+      <w:r/>
+    </w:p>
+    <w:p>
+      <w:pPr>
+        <w:pBdr/>
+        <w:spacing/>
+        <w:ind/>
+        <w:rPr/>
+      </w:pPr>
+      <w:r/>
+      <w:r/>
+      <w:r/>
+    </w:p>
+    <w:p>
+      <w:pPr>
+        <w:pBdr/>
+        <w:spacing/>
+        <w:ind/>
+        <w:rPr>
+          <w:highlight w:val="none"/>
+        </w:rPr>
+      </w:pPr>
+      <w:r>
+        <w:rPr>
+          <w:highlight w:val="none"/>
+        </w:rPr>
+        <w:t xml:space="preserve">APUNTES IA     </w:t>
+      </w:r>
+      <w:r/>
+    </w:p>
+    <w:p>
+      <w:pPr>
+        <w:pBdr/>
+        <w:spacing/>
+        <w:ind/>
+        <w:rPr/>
+      </w:pPr>
+      <w:r/>
+      <w:r/>
+      <w:r/>
+    </w:p>
+    <w:p>
+      <w:pPr>
+        <w:pBdr/>
+        <w:spacing/>
+        <w:ind/>
+        <w:rPr/>
+      </w:pPr>
+      <w:r>
+        <w:rPr>
+          <w:highlight w:val="none"/>
+        </w:rPr>
+      </w:r>
+      <w:r>
+        <w:rPr>
+          <w:highlight w:val="none"/>
+        </w:rPr>
+      </w:r>
+      <w:r>
+        <w:rPr>
+          <w:highlight w:val="none"/>
+        </w:rPr>
+      </w:r>
     </w:p>
     <w:sectPr>
       <w:footnotePr/>
@@ -122,7 +195,6 @@
         <w:ind/>
         <w:rPr/>
       </w:pPr>
-      <w:r/>
       <w:r>
         <w:separator/>
       </w:r>
@@ -137,7 +209,6 @@
         <w:ind/>
         <w:rPr/>
       </w:pPr>
-      <w:r/>
       <w:r>
         <w:continuationSeparator/>
       </w:r>
@@ -157,7 +228,6 @@
         <w:ind/>
         <w:rPr/>
       </w:pPr>
-      <w:r/>
       <w:r>
         <w:separator/>
       </w:r>
@@ -172,7 +242,6 @@
         <w:ind/>
         <w:rPr/>
       </w:pPr>
-      <w:r/>
       <w:r>
         <w:continuationSeparator/>
       </w:r>
@@ -340,9 +409,9 @@
     <w:lsdException w:name="Bibliography" w:uiPriority="37"/>
     <w:lsdException w:name="TOC Heading" w:uiPriority="39" w:qFormat="1"/>
   </w:latentStyles>
-  <w:style w:type="table" w:styleId="12">
+  <w:style w:type="table" w:styleId="701">
     <w:name w:val="Table Grid"/>
-    <w:basedOn w:val="665"/>
+    <w:basedOn w:val="887"/>
     <w:uiPriority w:val="59"/>
     <w:pPr>
       <w:pBdr/>
@@ -539,9 +608,9 @@
       </w:tcPr>
     </w:tblStylePr>
   </w:style>
-  <w:style w:type="table" w:styleId="13">
+  <w:style w:type="table" w:styleId="702">
     <w:name w:val="Table Grid Light"/>
-    <w:basedOn w:val="665"/>
+    <w:basedOn w:val="887"/>
     <w:uiPriority w:val="59"/>
     <w:pPr>
       <w:pBdr/>
@@ -738,9 +807,9 @@
       </w:tcPr>
     </w:tblStylePr>
   </w:style>
-  <w:style w:type="table" w:styleId="14">
+  <w:style w:type="table" w:styleId="703">
     <w:name w:val="Plain Table 1"/>
-    <w:basedOn w:val="665"/>
+    <w:basedOn w:val="887"/>
     <w:uiPriority w:val="59"/>
     <w:pPr>
       <w:pBdr/>
@@ -963,9 +1032,9 @@
       </w:tcPr>
     </w:tblStylePr>
   </w:style>
-  <w:style w:type="table" w:styleId="15">
+  <w:style w:type="table" w:styleId="704">
     <w:name w:val="Plain Table 2"/>
-    <w:basedOn w:val="665"/>
+    <w:basedOn w:val="887"/>
     <w:uiPriority w:val="59"/>
     <w:pPr>
       <w:pBdr/>
@@ -1196,9 +1265,9 @@
       </w:tcPr>
     </w:tblStylePr>
   </w:style>
-  <w:style w:type="table" w:styleId="16">
+  <w:style w:type="table" w:styleId="705">
     <w:name w:val="Plain Table 3"/>
-    <w:basedOn w:val="665"/>
+    <w:basedOn w:val="887"/>
     <w:uiPriority w:val="99"/>
     <w:pPr>
       <w:pBdr/>
@@ -1426,9 +1495,9 @@
       </w:tcPr>
     </w:tblStylePr>
   </w:style>
-  <w:style w:type="table" w:styleId="17">
+  <w:style w:type="table" w:styleId="706">
     <w:name w:val="Plain Table 4"/>
-    <w:basedOn w:val="665"/>
+    <w:basedOn w:val="887"/>
     <w:uiPriority w:val="99"/>
     <w:pPr>
       <w:pBdr/>
@@ -1642,9 +1711,9 @@
       </w:tcPr>
     </w:tblStylePr>
   </w:style>
-  <w:style w:type="table" w:styleId="18">
+  <w:style w:type="table" w:styleId="707">
     <w:name w:val="Plain Table 5"/>
-    <w:basedOn w:val="665"/>
+    <w:basedOn w:val="887"/>
     <w:uiPriority w:val="99"/>
     <w:pPr>
       <w:pBdr/>
@@ -1875,9 +1944,9 @@
       </w:tcPr>
     </w:tblStylePr>
   </w:style>
-  <w:style w:type="table" w:styleId="19">
+  <w:style w:type="table" w:styleId="708">
     <w:name w:val="Grid Table 1 Light"/>
-    <w:basedOn w:val="665"/>
+    <w:basedOn w:val="887"/>
     <w:uiPriority w:val="99"/>
     <w:pPr>
       <w:pBdr/>
@@ -2098,9 +2167,9 @@
       </w:tcPr>
     </w:tblStylePr>
   </w:style>
-  <w:style w:type="table" w:styleId="20">
+  <w:style w:type="table" w:styleId="709">
     <w:name w:val="Grid Table 1 Light - Accent 1"/>
-    <w:basedOn w:val="665"/>
+    <w:basedOn w:val="887"/>
     <w:uiPriority w:val="99"/>
     <w:pPr>
       <w:pBdr/>
@@ -2321,9 +2390,9 @@
       </w:tcPr>
     </w:tblStylePr>
   </w:style>
-  <w:style w:type="table" w:styleId="21">
+  <w:style w:type="table" w:styleId="710">
     <w:name w:val="Grid Table 1 Light - Accent 2"/>
-    <w:basedOn w:val="665"/>
+    <w:basedOn w:val="887"/>
     <w:uiPriority w:val="99"/>
     <w:pPr>
       <w:pBdr/>
@@ -2544,9 +2613,9 @@
       </w:tcPr>
     </w:tblStylePr>
   </w:style>
-  <w:style w:type="table" w:styleId="22">
+  <w:style w:type="table" w:styleId="711">
     <w:name w:val="Grid Table 1 Light - Accent 3"/>
-    <w:basedOn w:val="665"/>
+    <w:basedOn w:val="887"/>
     <w:uiPriority w:val="99"/>
     <w:pPr>
       <w:pBdr/>
@@ -2767,9 +2836,9 @@
       </w:tcPr>
     </w:tblStylePr>
   </w:style>
-  <w:style w:type="table" w:styleId="23">
+  <w:style w:type="table" w:styleId="712">
     <w:name w:val="Grid Table 1 Light - Accent 4"/>
-    <w:basedOn w:val="665"/>
+    <w:basedOn w:val="887"/>
     <w:uiPriority w:val="99"/>
     <w:pPr>
       <w:pBdr/>
@@ -2990,9 +3059,9 @@
       </w:tcPr>
     </w:tblStylePr>
   </w:style>
-  <w:style w:type="table" w:styleId="24">
+  <w:style w:type="table" w:styleId="713">
     <w:name w:val="Grid Table 1 Light - Accent 5"/>
-    <w:basedOn w:val="665"/>
+    <w:basedOn w:val="887"/>
     <w:uiPriority w:val="99"/>
     <w:pPr>
       <w:pBdr/>
@@ -3213,9 +3282,9 @@
       </w:tcPr>
     </w:tblStylePr>
   </w:style>
-  <w:style w:type="table" w:styleId="25">
+  <w:style w:type="table" w:styleId="714">
     <w:name w:val="Grid Table 1 Light - Accent 6"/>
-    <w:basedOn w:val="665"/>
+    <w:basedOn w:val="887"/>
     <w:uiPriority w:val="99"/>
     <w:pPr>
       <w:pBdr/>
@@ -3436,9 +3505,9 @@
       </w:tcPr>
     </w:tblStylePr>
   </w:style>
-  <w:style w:type="table" w:styleId="26">
+  <w:style w:type="table" w:styleId="715">
     <w:name w:val="Grid Table 2"/>
-    <w:basedOn w:val="665"/>
+    <w:basedOn w:val="887"/>
     <w:uiPriority w:val="99"/>
     <w:pPr>
       <w:pBdr/>
@@ -3668,9 +3737,9 @@
       </w:tcPr>
     </w:tblStylePr>
   </w:style>
-  <w:style w:type="table" w:styleId="27">
+  <w:style w:type="table" w:styleId="716">
     <w:name w:val="Grid Table 2 - Accent 1"/>
-    <w:basedOn w:val="665"/>
+    <w:basedOn w:val="887"/>
     <w:uiPriority w:val="99"/>
     <w:pPr>
       <w:pBdr/>
@@ -3900,9 +3969,9 @@
       </w:tcPr>
     </w:tblStylePr>
   </w:style>
-  <w:style w:type="table" w:styleId="28">
+  <w:style w:type="table" w:styleId="717">
     <w:name w:val="Grid Table 2 - Accent 2"/>
-    <w:basedOn w:val="665"/>
+    <w:basedOn w:val="887"/>
     <w:uiPriority w:val="99"/>
     <w:pPr>
       <w:pBdr/>
@@ -4132,9 +4201,9 @@
       </w:tcPr>
     </w:tblStylePr>
   </w:style>
-  <w:style w:type="table" w:styleId="29">
+  <w:style w:type="table" w:styleId="718">
     <w:name w:val="Grid Table 2 - Accent 3"/>
-    <w:basedOn w:val="665"/>
+    <w:basedOn w:val="887"/>
     <w:uiPriority w:val="99"/>
     <w:pPr>
       <w:pBdr/>
@@ -4364,9 +4433,9 @@
       </w:tcPr>
     </w:tblStylePr>
   </w:style>
-  <w:style w:type="table" w:styleId="30">
+  <w:style w:type="table" w:styleId="719">
     <w:name w:val="Grid Table 2 - Accent 4"/>
-    <w:basedOn w:val="665"/>
+    <w:basedOn w:val="887"/>
     <w:uiPriority w:val="99"/>
     <w:pPr>
       <w:pBdr/>
@@ -4596,9 +4665,9 @@
       </w:tcPr>
     </w:tblStylePr>
   </w:style>
-  <w:style w:type="table" w:styleId="31">
+  <w:style w:type="table" w:styleId="720">
     <w:name w:val="Grid Table 2 - Accent 5"/>
-    <w:basedOn w:val="665"/>
+    <w:basedOn w:val="887"/>
     <w:uiPriority w:val="99"/>
     <w:pPr>
       <w:pBdr/>
@@ -4828,9 +4897,9 @@
       </w:tcPr>
     </w:tblStylePr>
   </w:style>
-  <w:style w:type="table" w:styleId="32">
+  <w:style w:type="table" w:styleId="721">
     <w:name w:val="Grid Table 2 - Accent 6"/>
-    <w:basedOn w:val="665"/>
+    <w:basedOn w:val="887"/>
     <w:uiPriority w:val="99"/>
     <w:pPr>
       <w:pBdr/>
@@ -5060,9 +5129,9 @@
       </w:tcPr>
     </w:tblStylePr>
   </w:style>
-  <w:style w:type="table" w:styleId="33">
+  <w:style w:type="table" w:styleId="722">
     <w:name w:val="Grid Table 3"/>
-    <w:basedOn w:val="665"/>
+    <w:basedOn w:val="887"/>
     <w:uiPriority w:val="99"/>
     <w:pPr>
       <w:pBdr/>
@@ -5161,29 +5230,6 @@
         <w:tblBorders/>
       </w:tblPr>
       <w:tcPr>
-        <w:shd w:color="ffffff"/>
-        <w:tcBorders>
-          <w:top w:val="none" w:color="000000" w:sz="4" w:space="0"/>
-          <w:left w:val="none" w:color="000000" w:sz="4" w:space="0"/>
-          <w:bottom w:val="none" w:color="000000" w:sz="4" w:space="0"/>
-          <w:right w:val="none" w:color="000000" w:sz="4" w:space="0"/>
-        </w:tcBorders>
-      </w:tcPr>
-    </w:tblStylePr>
-    <w:tblStylePr w:type="firstRow">
-      <w:rPr>
-        <w:b/>
-        <w:color w:val="404040"/>
-      </w:rPr>
-      <w:pPr>
-        <w:pBdr/>
-        <w:spacing/>
-        <w:ind/>
-      </w:pPr>
-      <w:tblPr>
-        <w:tblBorders/>
-      </w:tblPr>
-      <w:tcPr>
         <w:shd w:val="clear" w:color="ffffff"/>
         <w:tcBorders>
           <w:top w:val="none" w:color="000000" w:sz="4" w:space="0"/>
@@ -5193,30 +5239,7 @@
         </w:tcBorders>
       </w:tcPr>
     </w:tblStylePr>
-    <w:tblStylePr w:type="lastCol">
-      <w:rPr>
-        <w:i/>
-        <w:color w:val="404040"/>
-      </w:rPr>
-      <w:pPr>
-        <w:pBdr/>
-        <w:spacing/>
-        <w:ind/>
-      </w:pPr>
-      <w:tblPr>
-        <w:tblBorders/>
-      </w:tblPr>
-      <w:tcPr>
-        <w:shd w:color="ffffff"/>
-        <w:tcBorders>
-          <w:top w:val="none" w:color="000000" w:sz="4" w:space="0"/>
-          <w:left w:val="none" w:color="000000" w:sz="4" w:space="0"/>
-          <w:bottom w:val="none" w:color="000000" w:sz="4" w:space="0"/>
-          <w:right w:val="none" w:color="000000" w:sz="4" w:space="0"/>
-        </w:tcBorders>
-      </w:tcPr>
-    </w:tblStylePr>
-    <w:tblStylePr w:type="lastRow">
+    <w:tblStylePr w:type="firstRow">
       <w:rPr>
         <w:b/>
         <w:color w:val="404040"/>
@@ -5239,6 +5262,52 @@
         </w:tcBorders>
       </w:tcPr>
     </w:tblStylePr>
+    <w:tblStylePr w:type="lastCol">
+      <w:rPr>
+        <w:i/>
+        <w:color w:val="404040"/>
+      </w:rPr>
+      <w:pPr>
+        <w:pBdr/>
+        <w:spacing/>
+        <w:ind/>
+      </w:pPr>
+      <w:tblPr>
+        <w:tblBorders/>
+      </w:tblPr>
+      <w:tcPr>
+        <w:shd w:val="clear" w:color="ffffff"/>
+        <w:tcBorders>
+          <w:top w:val="none" w:color="000000" w:sz="4" w:space="0"/>
+          <w:left w:val="none" w:color="000000" w:sz="4" w:space="0"/>
+          <w:bottom w:val="none" w:color="000000" w:sz="4" w:space="0"/>
+          <w:right w:val="none" w:color="000000" w:sz="4" w:space="0"/>
+        </w:tcBorders>
+      </w:tcPr>
+    </w:tblStylePr>
+    <w:tblStylePr w:type="lastRow">
+      <w:rPr>
+        <w:b/>
+        <w:color w:val="404040"/>
+      </w:rPr>
+      <w:pPr>
+        <w:pBdr/>
+        <w:spacing/>
+        <w:ind/>
+      </w:pPr>
+      <w:tblPr>
+        <w:tblBorders/>
+      </w:tblPr>
+      <w:tcPr>
+        <w:shd w:val="clear" w:color="ffffff"/>
+        <w:tcBorders>
+          <w:top w:val="none" w:color="000000" w:sz="4" w:space="0"/>
+          <w:left w:val="none" w:color="000000" w:sz="4" w:space="0"/>
+          <w:bottom w:val="none" w:color="000000" w:sz="4" w:space="0"/>
+          <w:right w:val="none" w:color="000000" w:sz="4" w:space="0"/>
+        </w:tcBorders>
+      </w:tcPr>
+    </w:tblStylePr>
     <w:tblStylePr w:type="nwCell">
       <w:pPr>
         <w:pBdr/>
@@ -5305,9 +5374,9 @@
       </w:tcPr>
     </w:tblStylePr>
   </w:style>
-  <w:style w:type="table" w:styleId="34">
+  <w:style w:type="table" w:styleId="723">
     <w:name w:val="Grid Table 3 - Accent 1"/>
-    <w:basedOn w:val="665"/>
+    <w:basedOn w:val="887"/>
     <w:uiPriority w:val="99"/>
     <w:pPr>
       <w:pBdr/>
@@ -5406,29 +5475,6 @@
         <w:tblBorders/>
       </w:tblPr>
       <w:tcPr>
-        <w:shd w:color="ffffff"/>
-        <w:tcBorders>
-          <w:top w:val="none" w:color="000000" w:sz="4" w:space="0"/>
-          <w:left w:val="none" w:color="000000" w:sz="4" w:space="0"/>
-          <w:bottom w:val="none" w:color="000000" w:sz="4" w:space="0"/>
-          <w:right w:val="none" w:color="000000" w:sz="4" w:space="0"/>
-        </w:tcBorders>
-      </w:tcPr>
-    </w:tblStylePr>
-    <w:tblStylePr w:type="firstRow">
-      <w:rPr>
-        <w:b/>
-        <w:color w:val="404040"/>
-      </w:rPr>
-      <w:pPr>
-        <w:pBdr/>
-        <w:spacing/>
-        <w:ind/>
-      </w:pPr>
-      <w:tblPr>
-        <w:tblBorders/>
-      </w:tblPr>
-      <w:tcPr>
         <w:shd w:val="clear" w:color="ffffff"/>
         <w:tcBorders>
           <w:top w:val="none" w:color="000000" w:sz="4" w:space="0"/>
@@ -5438,30 +5484,7 @@
         </w:tcBorders>
       </w:tcPr>
     </w:tblStylePr>
-    <w:tblStylePr w:type="lastCol">
-      <w:rPr>
-        <w:i/>
-        <w:color w:val="404040"/>
-      </w:rPr>
-      <w:pPr>
-        <w:pBdr/>
-        <w:spacing/>
-        <w:ind/>
-      </w:pPr>
-      <w:tblPr>
-        <w:tblBorders/>
-      </w:tblPr>
-      <w:tcPr>
-        <w:shd w:color="ffffff"/>
-        <w:tcBorders>
-          <w:top w:val="none" w:color="000000" w:sz="4" w:space="0"/>
-          <w:left w:val="none" w:color="000000" w:sz="4" w:space="0"/>
-          <w:bottom w:val="none" w:color="000000" w:sz="4" w:space="0"/>
-          <w:right w:val="none" w:color="000000" w:sz="4" w:space="0"/>
-        </w:tcBorders>
-      </w:tcPr>
-    </w:tblStylePr>
-    <w:tblStylePr w:type="lastRow">
+    <w:tblStylePr w:type="firstRow">
       <w:rPr>
         <w:b/>
         <w:color w:val="404040"/>
@@ -5484,6 +5507,52 @@
         </w:tcBorders>
       </w:tcPr>
     </w:tblStylePr>
+    <w:tblStylePr w:type="lastCol">
+      <w:rPr>
+        <w:i/>
+        <w:color w:val="404040"/>
+      </w:rPr>
+      <w:pPr>
+        <w:pBdr/>
+        <w:spacing/>
+        <w:ind/>
+      </w:pPr>
+      <w:tblPr>
+        <w:tblBorders/>
+      </w:tblPr>
+      <w:tcPr>
+        <w:shd w:val="clear" w:color="ffffff"/>
+        <w:tcBorders>
+          <w:top w:val="none" w:color="000000" w:sz="4" w:space="0"/>
+          <w:left w:val="none" w:color="000000" w:sz="4" w:space="0"/>
+          <w:bottom w:val="none" w:color="000000" w:sz="4" w:space="0"/>
+          <w:right w:val="none" w:color="000000" w:sz="4" w:space="0"/>
+        </w:tcBorders>
+      </w:tcPr>
+    </w:tblStylePr>
+    <w:tblStylePr w:type="lastRow">
+      <w:rPr>
+        <w:b/>
+        <w:color w:val="404040"/>
+      </w:rPr>
+      <w:pPr>
+        <w:pBdr/>
+        <w:spacing/>
+        <w:ind/>
+      </w:pPr>
+      <w:tblPr>
+        <w:tblBorders/>
+      </w:tblPr>
+      <w:tcPr>
+        <w:shd w:val="clear" w:color="ffffff"/>
+        <w:tcBorders>
+          <w:top w:val="none" w:color="000000" w:sz="4" w:space="0"/>
+          <w:left w:val="none" w:color="000000" w:sz="4" w:space="0"/>
+          <w:bottom w:val="none" w:color="000000" w:sz="4" w:space="0"/>
+          <w:right w:val="none" w:color="000000" w:sz="4" w:space="0"/>
+        </w:tcBorders>
+      </w:tcPr>
+    </w:tblStylePr>
     <w:tblStylePr w:type="nwCell">
       <w:pPr>
         <w:pBdr/>
@@ -5550,9 +5619,9 @@
       </w:tcPr>
     </w:tblStylePr>
   </w:style>
-  <w:style w:type="table" w:styleId="35">
+  <w:style w:type="table" w:styleId="724">
     <w:name w:val="Grid Table 3 - Accent 2"/>
-    <w:basedOn w:val="665"/>
+    <w:basedOn w:val="887"/>
     <w:uiPriority w:val="99"/>
     <w:pPr>
       <w:pBdr/>
@@ -5651,29 +5720,6 @@
         <w:tblBorders/>
       </w:tblPr>
       <w:tcPr>
-        <w:shd w:color="ffffff"/>
-        <w:tcBorders>
-          <w:top w:val="none" w:color="000000" w:sz="4" w:space="0"/>
-          <w:left w:val="none" w:color="000000" w:sz="4" w:space="0"/>
-          <w:bottom w:val="none" w:color="000000" w:sz="4" w:space="0"/>
-          <w:right w:val="none" w:color="000000" w:sz="4" w:space="0"/>
-        </w:tcBorders>
-      </w:tcPr>
-    </w:tblStylePr>
-    <w:tblStylePr w:type="firstRow">
-      <w:rPr>
-        <w:b/>
-        <w:color w:val="404040"/>
-      </w:rPr>
-      <w:pPr>
-        <w:pBdr/>
-        <w:spacing/>
-        <w:ind/>
-      </w:pPr>
-      <w:tblPr>
-        <w:tblBorders/>
-      </w:tblPr>
-      <w:tcPr>
         <w:shd w:val="clear" w:color="ffffff"/>
         <w:tcBorders>
           <w:top w:val="none" w:color="000000" w:sz="4" w:space="0"/>
@@ -5683,30 +5729,7 @@
         </w:tcBorders>
       </w:tcPr>
     </w:tblStylePr>
-    <w:tblStylePr w:type="lastCol">
-      <w:rPr>
-        <w:i/>
-        <w:color w:val="404040"/>
-      </w:rPr>
-      <w:pPr>
-        <w:pBdr/>
-        <w:spacing/>
-        <w:ind/>
-      </w:pPr>
-      <w:tblPr>
-        <w:tblBorders/>
-      </w:tblPr>
-      <w:tcPr>
-        <w:shd w:color="ffffff"/>
-        <w:tcBorders>
-          <w:top w:val="none" w:color="000000" w:sz="4" w:space="0"/>
-          <w:left w:val="none" w:color="000000" w:sz="4" w:space="0"/>
-          <w:bottom w:val="none" w:color="000000" w:sz="4" w:space="0"/>
-          <w:right w:val="none" w:color="000000" w:sz="4" w:space="0"/>
-        </w:tcBorders>
-      </w:tcPr>
-    </w:tblStylePr>
-    <w:tblStylePr w:type="lastRow">
+    <w:tblStylePr w:type="firstRow">
       <w:rPr>
         <w:b/>
         <w:color w:val="404040"/>
@@ -5729,6 +5752,52 @@
         </w:tcBorders>
       </w:tcPr>
     </w:tblStylePr>
+    <w:tblStylePr w:type="lastCol">
+      <w:rPr>
+        <w:i/>
+        <w:color w:val="404040"/>
+      </w:rPr>
+      <w:pPr>
+        <w:pBdr/>
+        <w:spacing/>
+        <w:ind/>
+      </w:pPr>
+      <w:tblPr>
+        <w:tblBorders/>
+      </w:tblPr>
+      <w:tcPr>
+        <w:shd w:val="clear" w:color="ffffff"/>
+        <w:tcBorders>
+          <w:top w:val="none" w:color="000000" w:sz="4" w:space="0"/>
+          <w:left w:val="none" w:color="000000" w:sz="4" w:space="0"/>
+          <w:bottom w:val="none" w:color="000000" w:sz="4" w:space="0"/>
+          <w:right w:val="none" w:color="000000" w:sz="4" w:space="0"/>
+        </w:tcBorders>
+      </w:tcPr>
+    </w:tblStylePr>
+    <w:tblStylePr w:type="lastRow">
+      <w:rPr>
+        <w:b/>
+        <w:color w:val="404040"/>
+      </w:rPr>
+      <w:pPr>
+        <w:pBdr/>
+        <w:spacing/>
+        <w:ind/>
+      </w:pPr>
+      <w:tblPr>
+        <w:tblBorders/>
+      </w:tblPr>
+      <w:tcPr>
+        <w:shd w:val="clear" w:color="ffffff"/>
+        <w:tcBorders>
+          <w:top w:val="none" w:color="000000" w:sz="4" w:space="0"/>
+          <w:left w:val="none" w:color="000000" w:sz="4" w:space="0"/>
+          <w:bottom w:val="none" w:color="000000" w:sz="4" w:space="0"/>
+          <w:right w:val="none" w:color="000000" w:sz="4" w:space="0"/>
+        </w:tcBorders>
+      </w:tcPr>
+    </w:tblStylePr>
     <w:tblStylePr w:type="nwCell">
       <w:pPr>
         <w:pBdr/>
@@ -5795,9 +5864,9 @@
       </w:tcPr>
     </w:tblStylePr>
   </w:style>
-  <w:style w:type="table" w:styleId="36">
+  <w:style w:type="table" w:styleId="725">
     <w:name w:val="Grid Table 3 - Accent 3"/>
-    <w:basedOn w:val="665"/>
+    <w:basedOn w:val="887"/>
     <w:uiPriority w:val="99"/>
     <w:pPr>
       <w:pBdr/>
@@ -5896,29 +5965,6 @@
         <w:tblBorders/>
       </w:tblPr>
       <w:tcPr>
-        <w:shd w:color="ffffff"/>
-        <w:tcBorders>
-          <w:top w:val="none" w:color="000000" w:sz="4" w:space="0"/>
-          <w:left w:val="none" w:color="000000" w:sz="4" w:space="0"/>
-          <w:bottom w:val="none" w:color="000000" w:sz="4" w:space="0"/>
-          <w:right w:val="none" w:color="000000" w:sz="4" w:space="0"/>
-        </w:tcBorders>
-      </w:tcPr>
-    </w:tblStylePr>
-    <w:tblStylePr w:type="firstRow">
-      <w:rPr>
-        <w:b/>
-        <w:color w:val="404040"/>
-      </w:rPr>
-      <w:pPr>
-        <w:pBdr/>
-        <w:spacing/>
-        <w:ind/>
-      </w:pPr>
-      <w:tblPr>
-        <w:tblBorders/>
-      </w:tblPr>
-      <w:tcPr>
         <w:shd w:val="clear" w:color="ffffff"/>
         <w:tcBorders>
           <w:top w:val="none" w:color="000000" w:sz="4" w:space="0"/>
@@ -5928,30 +5974,7 @@
         </w:tcBorders>
       </w:tcPr>
     </w:tblStylePr>
-    <w:tblStylePr w:type="lastCol">
-      <w:rPr>
-        <w:i/>
-        <w:color w:val="404040"/>
-      </w:rPr>
-      <w:pPr>
-        <w:pBdr/>
-        <w:spacing/>
-        <w:ind/>
-      </w:pPr>
-      <w:tblPr>
-        <w:tblBorders/>
-      </w:tblPr>
-      <w:tcPr>
-        <w:shd w:color="ffffff"/>
-        <w:tcBorders>
-          <w:top w:val="none" w:color="000000" w:sz="4" w:space="0"/>
-          <w:left w:val="none" w:color="000000" w:sz="4" w:space="0"/>
-          <w:bottom w:val="none" w:color="000000" w:sz="4" w:space="0"/>
-          <w:right w:val="none" w:color="000000" w:sz="4" w:space="0"/>
-        </w:tcBorders>
-      </w:tcPr>
-    </w:tblStylePr>
-    <w:tblStylePr w:type="lastRow">
+    <w:tblStylePr w:type="firstRow">
       <w:rPr>
         <w:b/>
         <w:color w:val="404040"/>
@@ -5974,6 +5997,52 @@
         </w:tcBorders>
       </w:tcPr>
     </w:tblStylePr>
+    <w:tblStylePr w:type="lastCol">
+      <w:rPr>
+        <w:i/>
+        <w:color w:val="404040"/>
+      </w:rPr>
+      <w:pPr>
+        <w:pBdr/>
+        <w:spacing/>
+        <w:ind/>
+      </w:pPr>
+      <w:tblPr>
+        <w:tblBorders/>
+      </w:tblPr>
+      <w:tcPr>
+        <w:shd w:val="clear" w:color="ffffff"/>
+        <w:tcBorders>
+          <w:top w:val="none" w:color="000000" w:sz="4" w:space="0"/>
+          <w:left w:val="none" w:color="000000" w:sz="4" w:space="0"/>
+          <w:bottom w:val="none" w:color="000000" w:sz="4" w:space="0"/>
+          <w:right w:val="none" w:color="000000" w:sz="4" w:space="0"/>
+        </w:tcBorders>
+      </w:tcPr>
+    </w:tblStylePr>
+    <w:tblStylePr w:type="lastRow">
+      <w:rPr>
+        <w:b/>
+        <w:color w:val="404040"/>
+      </w:rPr>
+      <w:pPr>
+        <w:pBdr/>
+        <w:spacing/>
+        <w:ind/>
+      </w:pPr>
+      <w:tblPr>
+        <w:tblBorders/>
+      </w:tblPr>
+      <w:tcPr>
+        <w:shd w:val="clear" w:color="ffffff"/>
+        <w:tcBorders>
+          <w:top w:val="none" w:color="000000" w:sz="4" w:space="0"/>
+          <w:left w:val="none" w:color="000000" w:sz="4" w:space="0"/>
+          <w:bottom w:val="none" w:color="000000" w:sz="4" w:space="0"/>
+          <w:right w:val="none" w:color="000000" w:sz="4" w:space="0"/>
+        </w:tcBorders>
+      </w:tcPr>
+    </w:tblStylePr>
     <w:tblStylePr w:type="nwCell">
       <w:pPr>
         <w:pBdr/>
@@ -6040,9 +6109,9 @@
       </w:tcPr>
     </w:tblStylePr>
   </w:style>
-  <w:style w:type="table" w:styleId="37">
+  <w:style w:type="table" w:styleId="726">
     <w:name w:val="Grid Table 3 - Accent 4"/>
-    <w:basedOn w:val="665"/>
+    <w:basedOn w:val="887"/>
     <w:uiPriority w:val="99"/>
     <w:pPr>
       <w:pBdr/>
@@ -6141,29 +6210,6 @@
         <w:tblBorders/>
       </w:tblPr>
       <w:tcPr>
-        <w:shd w:color="ffffff"/>
-        <w:tcBorders>
-          <w:top w:val="none" w:color="000000" w:sz="4" w:space="0"/>
-          <w:left w:val="none" w:color="000000" w:sz="4" w:space="0"/>
-          <w:bottom w:val="none" w:color="000000" w:sz="4" w:space="0"/>
-          <w:right w:val="none" w:color="000000" w:sz="4" w:space="0"/>
-        </w:tcBorders>
-      </w:tcPr>
-    </w:tblStylePr>
-    <w:tblStylePr w:type="firstRow">
-      <w:rPr>
-        <w:b/>
-        <w:color w:val="404040"/>
-      </w:rPr>
-      <w:pPr>
-        <w:pBdr/>
-        <w:spacing/>
-        <w:ind/>
-      </w:pPr>
-      <w:tblPr>
-        <w:tblBorders/>
-      </w:tblPr>
-      <w:tcPr>
         <w:shd w:val="clear" w:color="ffffff"/>
         <w:tcBorders>
           <w:top w:val="none" w:color="000000" w:sz="4" w:space="0"/>
@@ -6173,30 +6219,7 @@
         </w:tcBorders>
       </w:tcPr>
     </w:tblStylePr>
-    <w:tblStylePr w:type="lastCol">
-      <w:rPr>
-        <w:i/>
-        <w:color w:val="404040"/>
-      </w:rPr>
-      <w:pPr>
-        <w:pBdr/>
-        <w:spacing/>
-        <w:ind/>
-      </w:pPr>
-      <w:tblPr>
-        <w:tblBorders/>
-      </w:tblPr>
-      <w:tcPr>
-        <w:shd w:color="ffffff"/>
-        <w:tcBorders>
-          <w:top w:val="none" w:color="000000" w:sz="4" w:space="0"/>
-          <w:left w:val="none" w:color="000000" w:sz="4" w:space="0"/>
-          <w:bottom w:val="none" w:color="000000" w:sz="4" w:space="0"/>
-          <w:right w:val="none" w:color="000000" w:sz="4" w:space="0"/>
-        </w:tcBorders>
-      </w:tcPr>
-    </w:tblStylePr>
-    <w:tblStylePr w:type="lastRow">
+    <w:tblStylePr w:type="firstRow">
       <w:rPr>
         <w:b/>
         <w:color w:val="404040"/>
@@ -6219,6 +6242,52 @@
         </w:tcBorders>
       </w:tcPr>
     </w:tblStylePr>
+    <w:tblStylePr w:type="lastCol">
+      <w:rPr>
+        <w:i/>
+        <w:color w:val="404040"/>
+      </w:rPr>
+      <w:pPr>
+        <w:pBdr/>
+        <w:spacing/>
+        <w:ind/>
+      </w:pPr>
+      <w:tblPr>
+        <w:tblBorders/>
+      </w:tblPr>
+      <w:tcPr>
+        <w:shd w:val="clear" w:color="ffffff"/>
+        <w:tcBorders>
+          <w:top w:val="none" w:color="000000" w:sz="4" w:space="0"/>
+          <w:left w:val="none" w:color="000000" w:sz="4" w:space="0"/>
+          <w:bottom w:val="none" w:color="000000" w:sz="4" w:space="0"/>
+          <w:right w:val="none" w:color="000000" w:sz="4" w:space="0"/>
+        </w:tcBorders>
+      </w:tcPr>
+    </w:tblStylePr>
+    <w:tblStylePr w:type="lastRow">
+      <w:rPr>
+        <w:b/>
+        <w:color w:val="404040"/>
+      </w:rPr>
+      <w:pPr>
+        <w:pBdr/>
+        <w:spacing/>
+        <w:ind/>
+      </w:pPr>
+      <w:tblPr>
+        <w:tblBorders/>
+      </w:tblPr>
+      <w:tcPr>
+        <w:shd w:val="clear" w:color="ffffff"/>
+        <w:tcBorders>
+          <w:top w:val="none" w:color="000000" w:sz="4" w:space="0"/>
+          <w:left w:val="none" w:color="000000" w:sz="4" w:space="0"/>
+          <w:bottom w:val="none" w:color="000000" w:sz="4" w:space="0"/>
+          <w:right w:val="none" w:color="000000" w:sz="4" w:space="0"/>
+        </w:tcBorders>
+      </w:tcPr>
+    </w:tblStylePr>
     <w:tblStylePr w:type="nwCell">
       <w:pPr>
         <w:pBdr/>
@@ -6285,9 +6354,9 @@
       </w:tcPr>
     </w:tblStylePr>
   </w:style>
-  <w:style w:type="table" w:styleId="38">
+  <w:style w:type="table" w:styleId="727">
     <w:name w:val="Grid Table 3 - Accent 5"/>
-    <w:basedOn w:val="665"/>
+    <w:basedOn w:val="887"/>
     <w:uiPriority w:val="99"/>
     <w:pPr>
       <w:pBdr/>
@@ -6386,29 +6455,6 @@
         <w:tblBorders/>
       </w:tblPr>
       <w:tcPr>
-        <w:shd w:color="ffffff"/>
-        <w:tcBorders>
-          <w:top w:val="none" w:color="000000" w:sz="4" w:space="0"/>
-          <w:left w:val="none" w:color="000000" w:sz="4" w:space="0"/>
-          <w:bottom w:val="none" w:color="000000" w:sz="4" w:space="0"/>
-          <w:right w:val="none" w:color="000000" w:sz="4" w:space="0"/>
-        </w:tcBorders>
-      </w:tcPr>
-    </w:tblStylePr>
-    <w:tblStylePr w:type="firstRow">
-      <w:rPr>
-        <w:b/>
-        <w:color w:val="404040"/>
-      </w:rPr>
-      <w:pPr>
-        <w:pBdr/>
-        <w:spacing/>
-        <w:ind/>
-      </w:pPr>
-      <w:tblPr>
-        <w:tblBorders/>
-      </w:tblPr>
-      <w:tcPr>
         <w:shd w:val="clear" w:color="ffffff"/>
         <w:tcBorders>
           <w:top w:val="none" w:color="000000" w:sz="4" w:space="0"/>
@@ -6418,30 +6464,7 @@
         </w:tcBorders>
       </w:tcPr>
     </w:tblStylePr>
-    <w:tblStylePr w:type="lastCol">
-      <w:rPr>
-        <w:i/>
-        <w:color w:val="404040"/>
-      </w:rPr>
-      <w:pPr>
-        <w:pBdr/>
-        <w:spacing/>
-        <w:ind/>
-      </w:pPr>
-      <w:tblPr>
-        <w:tblBorders/>
-      </w:tblPr>
-      <w:tcPr>
-        <w:shd w:color="ffffff"/>
-        <w:tcBorders>
-          <w:top w:val="none" w:color="000000" w:sz="4" w:space="0"/>
-          <w:left w:val="none" w:color="000000" w:sz="4" w:space="0"/>
-          <w:bottom w:val="none" w:color="000000" w:sz="4" w:space="0"/>
-          <w:right w:val="none" w:color="000000" w:sz="4" w:space="0"/>
-        </w:tcBorders>
-      </w:tcPr>
-    </w:tblStylePr>
-    <w:tblStylePr w:type="lastRow">
+    <w:tblStylePr w:type="firstRow">
       <w:rPr>
         <w:b/>
         <w:color w:val="404040"/>
@@ -6464,6 +6487,52 @@
         </w:tcBorders>
       </w:tcPr>
     </w:tblStylePr>
+    <w:tblStylePr w:type="lastCol">
+      <w:rPr>
+        <w:i/>
+        <w:color w:val="404040"/>
+      </w:rPr>
+      <w:pPr>
+        <w:pBdr/>
+        <w:spacing/>
+        <w:ind/>
+      </w:pPr>
+      <w:tblPr>
+        <w:tblBorders/>
+      </w:tblPr>
+      <w:tcPr>
+        <w:shd w:val="clear" w:color="ffffff"/>
+        <w:tcBorders>
+          <w:top w:val="none" w:color="000000" w:sz="4" w:space="0"/>
+          <w:left w:val="none" w:color="000000" w:sz="4" w:space="0"/>
+          <w:bottom w:val="none" w:color="000000" w:sz="4" w:space="0"/>
+          <w:right w:val="none" w:color="000000" w:sz="4" w:space="0"/>
+        </w:tcBorders>
+      </w:tcPr>
+    </w:tblStylePr>
+    <w:tblStylePr w:type="lastRow">
+      <w:rPr>
+        <w:b/>
+        <w:color w:val="404040"/>
+      </w:rPr>
+      <w:pPr>
+        <w:pBdr/>
+        <w:spacing/>
+        <w:ind/>
+      </w:pPr>
+      <w:tblPr>
+        <w:tblBorders/>
+      </w:tblPr>
+      <w:tcPr>
+        <w:shd w:val="clear" w:color="ffffff"/>
+        <w:tcBorders>
+          <w:top w:val="none" w:color="000000" w:sz="4" w:space="0"/>
+          <w:left w:val="none" w:color="000000" w:sz="4" w:space="0"/>
+          <w:bottom w:val="none" w:color="000000" w:sz="4" w:space="0"/>
+          <w:right w:val="none" w:color="000000" w:sz="4" w:space="0"/>
+        </w:tcBorders>
+      </w:tcPr>
+    </w:tblStylePr>
     <w:tblStylePr w:type="nwCell">
       <w:pPr>
         <w:pBdr/>
@@ -6530,9 +6599,9 @@
       </w:tcPr>
     </w:tblStylePr>
   </w:style>
-  <w:style w:type="table" w:styleId="39">
+  <w:style w:type="table" w:styleId="728">
     <w:name w:val="Grid Table 3 - Accent 6"/>
-    <w:basedOn w:val="665"/>
+    <w:basedOn w:val="887"/>
     <w:uiPriority w:val="99"/>
     <w:pPr>
       <w:pBdr/>
@@ -6631,29 +6700,6 @@
         <w:tblBorders/>
       </w:tblPr>
       <w:tcPr>
-        <w:shd w:color="ffffff"/>
-        <w:tcBorders>
-          <w:top w:val="none" w:color="000000" w:sz="4" w:space="0"/>
-          <w:left w:val="none" w:color="000000" w:sz="4" w:space="0"/>
-          <w:bottom w:val="none" w:color="000000" w:sz="4" w:space="0"/>
-          <w:right w:val="none" w:color="000000" w:sz="4" w:space="0"/>
-        </w:tcBorders>
-      </w:tcPr>
-    </w:tblStylePr>
-    <w:tblStylePr w:type="firstRow">
-      <w:rPr>
-        <w:b/>
-        <w:color w:val="404040"/>
-      </w:rPr>
-      <w:pPr>
-        <w:pBdr/>
-        <w:spacing/>
-        <w:ind/>
-      </w:pPr>
-      <w:tblPr>
-        <w:tblBorders/>
-      </w:tblPr>
-      <w:tcPr>
         <w:shd w:val="clear" w:color="ffffff"/>
         <w:tcBorders>
           <w:top w:val="none" w:color="000000" w:sz="4" w:space="0"/>
@@ -6663,30 +6709,7 @@
         </w:tcBorders>
       </w:tcPr>
     </w:tblStylePr>
-    <w:tblStylePr w:type="lastCol">
-      <w:rPr>
-        <w:i/>
-        <w:color w:val="404040"/>
-      </w:rPr>
-      <w:pPr>
-        <w:pBdr/>
-        <w:spacing/>
-        <w:ind/>
-      </w:pPr>
-      <w:tblPr>
-        <w:tblBorders/>
-      </w:tblPr>
-      <w:tcPr>
-        <w:shd w:color="ffffff"/>
-        <w:tcBorders>
-          <w:top w:val="none" w:color="000000" w:sz="4" w:space="0"/>
-          <w:left w:val="none" w:color="000000" w:sz="4" w:space="0"/>
-          <w:bottom w:val="none" w:color="000000" w:sz="4" w:space="0"/>
-          <w:right w:val="none" w:color="000000" w:sz="4" w:space="0"/>
-        </w:tcBorders>
-      </w:tcPr>
-    </w:tblStylePr>
-    <w:tblStylePr w:type="lastRow">
+    <w:tblStylePr w:type="firstRow">
       <w:rPr>
         <w:b/>
         <w:color w:val="404040"/>
@@ -6709,6 +6732,52 @@
         </w:tcBorders>
       </w:tcPr>
     </w:tblStylePr>
+    <w:tblStylePr w:type="lastCol">
+      <w:rPr>
+        <w:i/>
+        <w:color w:val="404040"/>
+      </w:rPr>
+      <w:pPr>
+        <w:pBdr/>
+        <w:spacing/>
+        <w:ind/>
+      </w:pPr>
+      <w:tblPr>
+        <w:tblBorders/>
+      </w:tblPr>
+      <w:tcPr>
+        <w:shd w:val="clear" w:color="ffffff"/>
+        <w:tcBorders>
+          <w:top w:val="none" w:color="000000" w:sz="4" w:space="0"/>
+          <w:left w:val="none" w:color="000000" w:sz="4" w:space="0"/>
+          <w:bottom w:val="none" w:color="000000" w:sz="4" w:space="0"/>
+          <w:right w:val="none" w:color="000000" w:sz="4" w:space="0"/>
+        </w:tcBorders>
+      </w:tcPr>
+    </w:tblStylePr>
+    <w:tblStylePr w:type="lastRow">
+      <w:rPr>
+        <w:b/>
+        <w:color w:val="404040"/>
+      </w:rPr>
+      <w:pPr>
+        <w:pBdr/>
+        <w:spacing/>
+        <w:ind/>
+      </w:pPr>
+      <w:tblPr>
+        <w:tblBorders/>
+      </w:tblPr>
+      <w:tcPr>
+        <w:shd w:val="clear" w:color="ffffff"/>
+        <w:tcBorders>
+          <w:top w:val="none" w:color="000000" w:sz="4" w:space="0"/>
+          <w:left w:val="none" w:color="000000" w:sz="4" w:space="0"/>
+          <w:bottom w:val="none" w:color="000000" w:sz="4" w:space="0"/>
+          <w:right w:val="none" w:color="000000" w:sz="4" w:space="0"/>
+        </w:tcBorders>
+      </w:tcPr>
+    </w:tblStylePr>
     <w:tblStylePr w:type="nwCell">
       <w:pPr>
         <w:pBdr/>
@@ -6775,9 +6844,9 @@
       </w:tcPr>
     </w:tblStylePr>
   </w:style>
-  <w:style w:type="table" w:styleId="40">
+  <w:style w:type="table" w:styleId="729">
     <w:name w:val="Grid Table 4"/>
-    <w:basedOn w:val="665"/>
+    <w:basedOn w:val="887"/>
     <w:uiPriority w:val="59"/>
     <w:pPr>
       <w:pBdr/>
@@ -7008,9 +7077,9 @@
       </w:tcPr>
     </w:tblStylePr>
   </w:style>
-  <w:style w:type="table" w:styleId="41">
+  <w:style w:type="table" w:styleId="730">
     <w:name w:val="Grid Table 4 - Accent 1"/>
-    <w:basedOn w:val="665"/>
+    <w:basedOn w:val="887"/>
     <w:uiPriority w:val="59"/>
     <w:pPr>
       <w:pBdr/>
@@ -7241,9 +7310,9 @@
       </w:tcPr>
     </w:tblStylePr>
   </w:style>
-  <w:style w:type="table" w:styleId="42">
+  <w:style w:type="table" w:styleId="731">
     <w:name w:val="Grid Table 4 - Accent 2"/>
-    <w:basedOn w:val="665"/>
+    <w:basedOn w:val="887"/>
     <w:uiPriority w:val="59"/>
     <w:pPr>
       <w:pBdr/>
@@ -7474,9 +7543,9 @@
       </w:tcPr>
     </w:tblStylePr>
   </w:style>
-  <w:style w:type="table" w:styleId="43">
+  <w:style w:type="table" w:styleId="732">
     <w:name w:val="Grid Table 4 - Accent 3"/>
-    <w:basedOn w:val="665"/>
+    <w:basedOn w:val="887"/>
     <w:uiPriority w:val="59"/>
     <w:pPr>
       <w:pBdr/>
@@ -7707,9 +7776,9 @@
       </w:tcPr>
     </w:tblStylePr>
   </w:style>
-  <w:style w:type="table" w:styleId="44">
+  <w:style w:type="table" w:styleId="733">
     <w:name w:val="Grid Table 4 - Accent 4"/>
-    <w:basedOn w:val="665"/>
+    <w:basedOn w:val="887"/>
     <w:uiPriority w:val="59"/>
     <w:pPr>
       <w:pBdr/>
@@ -7940,9 +8009,9 @@
       </w:tcPr>
     </w:tblStylePr>
   </w:style>
-  <w:style w:type="table" w:styleId="45">
+  <w:style w:type="table" w:styleId="734">
     <w:name w:val="Grid Table 4 - Accent 5"/>
-    <w:basedOn w:val="665"/>
+    <w:basedOn w:val="887"/>
     <w:uiPriority w:val="59"/>
     <w:pPr>
       <w:pBdr/>
@@ -8173,9 +8242,9 @@
       </w:tcPr>
     </w:tblStylePr>
   </w:style>
-  <w:style w:type="table" w:styleId="46">
+  <w:style w:type="table" w:styleId="735">
     <w:name w:val="Grid Table 4 - Accent 6"/>
-    <w:basedOn w:val="665"/>
+    <w:basedOn w:val="887"/>
     <w:uiPriority w:val="59"/>
     <w:pPr>
       <w:pBdr/>
@@ -8406,9 +8475,9 @@
       </w:tcPr>
     </w:tblStylePr>
   </w:style>
-  <w:style w:type="table" w:styleId="47">
+  <w:style w:type="table" w:styleId="736">
     <w:name w:val="Grid Table 5 Dark"/>
-    <w:basedOn w:val="665"/>
+    <w:basedOn w:val="887"/>
     <w:uiPriority w:val="99"/>
     <w:pPr>
       <w:pBdr/>
@@ -8634,9 +8703,9 @@
       </w:tcPr>
     </w:tblStylePr>
   </w:style>
-  <w:style w:type="table" w:styleId="48">
+  <w:style w:type="table" w:styleId="737">
     <w:name w:val="Grid Table 5 Dark- Accent 1"/>
-    <w:basedOn w:val="665"/>
+    <w:basedOn w:val="887"/>
     <w:uiPriority w:val="99"/>
     <w:pPr>
       <w:pBdr/>
@@ -8862,9 +8931,9 @@
       </w:tcPr>
     </w:tblStylePr>
   </w:style>
-  <w:style w:type="table" w:styleId="49">
+  <w:style w:type="table" w:styleId="738">
     <w:name w:val="Grid Table 5 Dark - Accent 2"/>
-    <w:basedOn w:val="665"/>
+    <w:basedOn w:val="887"/>
     <w:uiPriority w:val="99"/>
     <w:pPr>
       <w:pBdr/>
@@ -9090,9 +9159,9 @@
       </w:tcPr>
     </w:tblStylePr>
   </w:style>
-  <w:style w:type="table" w:styleId="50">
+  <w:style w:type="table" w:styleId="739">
     <w:name w:val="Grid Table 5 Dark - Accent 3"/>
-    <w:basedOn w:val="665"/>
+    <w:basedOn w:val="887"/>
     <w:uiPriority w:val="99"/>
     <w:pPr>
       <w:pBdr/>
@@ -9318,9 +9387,9 @@
       </w:tcPr>
     </w:tblStylePr>
   </w:style>
-  <w:style w:type="table" w:styleId="51">
+  <w:style w:type="table" w:styleId="740">
     <w:name w:val="Grid Table 5 Dark- Accent 4"/>
-    <w:basedOn w:val="665"/>
+    <w:basedOn w:val="887"/>
     <w:uiPriority w:val="99"/>
     <w:pPr>
       <w:pBdr/>
@@ -9546,9 +9615,9 @@
       </w:tcPr>
     </w:tblStylePr>
   </w:style>
-  <w:style w:type="table" w:styleId="52">
+  <w:style w:type="table" w:styleId="741">
     <w:name w:val="Grid Table 5 Dark - Accent 5"/>
-    <w:basedOn w:val="665"/>
+    <w:basedOn w:val="887"/>
     <w:uiPriority w:val="99"/>
     <w:pPr>
       <w:pBdr/>
@@ -9774,9 +9843,9 @@
       </w:tcPr>
     </w:tblStylePr>
   </w:style>
-  <w:style w:type="table" w:styleId="53">
+  <w:style w:type="table" w:styleId="742">
     <w:name w:val="Grid Table 5 Dark - Accent 6"/>
-    <w:basedOn w:val="665"/>
+    <w:basedOn w:val="887"/>
     <w:uiPriority w:val="99"/>
     <w:pPr>
       <w:pBdr/>
@@ -10002,9 +10071,9 @@
       </w:tcPr>
     </w:tblStylePr>
   </w:style>
-  <w:style w:type="table" w:styleId="54">
+  <w:style w:type="table" w:styleId="743">
     <w:name w:val="Grid Table 6 Colorful"/>
-    <w:basedOn w:val="665"/>
+    <w:basedOn w:val="887"/>
     <w:uiPriority w:val="99"/>
     <w:pPr>
       <w:pBdr/>
@@ -10232,9 +10301,9 @@
       </w:tcPr>
     </w:tblStylePr>
   </w:style>
-  <w:style w:type="table" w:styleId="55">
+  <w:style w:type="table" w:styleId="744">
     <w:name w:val="Grid Table 6 Colorful - Accent 1"/>
-    <w:basedOn w:val="665"/>
+    <w:basedOn w:val="887"/>
     <w:uiPriority w:val="99"/>
     <w:pPr>
       <w:pBdr/>
@@ -10462,9 +10531,9 @@
       </w:tcPr>
     </w:tblStylePr>
   </w:style>
-  <w:style w:type="table" w:styleId="56">
+  <w:style w:type="table" w:styleId="745">
     <w:name w:val="Grid Table 6 Colorful - Accent 2"/>
-    <w:basedOn w:val="665"/>
+    <w:basedOn w:val="887"/>
     <w:uiPriority w:val="99"/>
     <w:pPr>
       <w:pBdr/>
@@ -10692,9 +10761,9 @@
       </w:tcPr>
     </w:tblStylePr>
   </w:style>
-  <w:style w:type="table" w:styleId="57">
+  <w:style w:type="table" w:styleId="746">
     <w:name w:val="Grid Table 6 Colorful - Accent 3"/>
-    <w:basedOn w:val="665"/>
+    <w:basedOn w:val="887"/>
     <w:uiPriority w:val="99"/>
     <w:pPr>
       <w:pBdr/>
@@ -10922,9 +10991,9 @@
       </w:tcPr>
     </w:tblStylePr>
   </w:style>
-  <w:style w:type="table" w:styleId="58">
+  <w:style w:type="table" w:styleId="747">
     <w:name w:val="Grid Table 6 Colorful - Accent 4"/>
-    <w:basedOn w:val="665"/>
+    <w:basedOn w:val="887"/>
     <w:uiPriority w:val="99"/>
     <w:pPr>
       <w:pBdr/>
@@ -11152,9 +11221,9 @@
       </w:tcPr>
     </w:tblStylePr>
   </w:style>
-  <w:style w:type="table" w:styleId="59">
+  <w:style w:type="table" w:styleId="748">
     <w:name w:val="Grid Table 6 Colorful - Accent 5"/>
-    <w:basedOn w:val="665"/>
+    <w:basedOn w:val="887"/>
     <w:uiPriority w:val="99"/>
     <w:pPr>
       <w:pBdr/>
@@ -11382,9 +11451,9 @@
       </w:tcPr>
     </w:tblStylePr>
   </w:style>
-  <w:style w:type="table" w:styleId="60">
+  <w:style w:type="table" w:styleId="749">
     <w:name w:val="Grid Table 6 Colorful - Accent 6"/>
-    <w:basedOn w:val="665"/>
+    <w:basedOn w:val="887"/>
     <w:uiPriority w:val="99"/>
     <w:pPr>
       <w:pBdr/>
@@ -11612,9 +11681,9 @@
       </w:tcPr>
     </w:tblStylePr>
   </w:style>
-  <w:style w:type="table" w:styleId="61">
+  <w:style w:type="table" w:styleId="750">
     <w:name w:val="Grid Table 7 Colorful"/>
-    <w:basedOn w:val="665"/>
+    <w:basedOn w:val="887"/>
     <w:uiPriority w:val="99"/>
     <w:pPr>
       <w:pBdr/>
@@ -11716,11 +11785,11 @@
         <w:tblBorders/>
       </w:tblPr>
       <w:tcPr>
-        <w:shd w:color="ffffff"/>
+        <w:shd w:val="clear" w:color="ffffff"/>
         <w:tcBorders>
-          <w:top w:val="none"/>
-          <w:left w:val="none"/>
-          <w:bottom w:val="none"/>
+          <w:top w:val="none" w:color="000000" w:sz="4" w:space="0"/>
+          <w:left w:val="none" w:color="000000" w:sz="4" w:space="0"/>
+          <w:bottom w:val="none" w:color="000000" w:sz="4" w:space="0"/>
           <w:right w:val="single" w:color="000000" w:themeColor="text1" w:themeTint="80" w:sz="4" w:space="0"/>
         </w:tcBorders>
       </w:tcPr>
@@ -11743,10 +11812,10 @@
       <w:tcPr>
         <w:shd w:val="clear" w:color="ffffff" w:themeColor="light1" w:fill="ffffff" w:themeFill="light1"/>
         <w:tcBorders>
-          <w:top w:val="none"/>
-          <w:left w:val="none"/>
+          <w:top w:val="none" w:color="000000" w:sz="4" w:space="0"/>
+          <w:left w:val="none" w:color="000000" w:sz="4" w:space="0"/>
           <w:bottom w:val="single" w:color="000000" w:themeColor="text1" w:themeTint="80" w:sz="4" w:space="0"/>
-          <w:right w:val="none"/>
+          <w:right w:val="none" w:color="000000" w:sz="4" w:space="0"/>
         </w:tcBorders>
       </w:tcPr>
     </w:tblStylePr>
@@ -11766,12 +11835,12 @@
         <w:tblBorders/>
       </w:tblPr>
       <w:tcPr>
-        <w:shd w:color="ffffff"/>
+        <w:shd w:val="clear" w:color="ffffff"/>
         <w:tcBorders>
-          <w:top w:val="none"/>
+          <w:top w:val="none" w:color="000000" w:sz="4" w:space="0"/>
           <w:left w:val="single" w:color="000000" w:themeColor="text1" w:themeTint="80" w:sz="4" w:space="0"/>
-          <w:bottom w:val="none"/>
-          <w:right w:val="none"/>
+          <w:bottom w:val="none" w:color="000000" w:sz="4" w:space="0"/>
+          <w:right w:val="none" w:color="000000" w:sz="4" w:space="0"/>
         </w:tcBorders>
       </w:tcPr>
     </w:tblStylePr>
@@ -11794,9 +11863,9 @@
         <w:shd w:val="clear" w:color="ffffff" w:themeColor="light1" w:fill="ffffff" w:themeFill="light1"/>
         <w:tcBorders>
           <w:top w:val="single" w:color="000000" w:themeColor="text1" w:themeTint="80" w:sz="4" w:space="0"/>
-          <w:left w:val="none"/>
-          <w:bottom w:val="none"/>
-          <w:right w:val="none"/>
+          <w:left w:val="none" w:color="000000" w:sz="4" w:space="0"/>
+          <w:bottom w:val="none" w:color="000000" w:sz="4" w:space="0"/>
+          <w:right w:val="none" w:color="000000" w:sz="4" w:space="0"/>
         </w:tcBorders>
       </w:tcPr>
     </w:tblStylePr>
@@ -11866,9 +11935,9 @@
       </w:tcPr>
     </w:tblStylePr>
   </w:style>
-  <w:style w:type="table" w:styleId="62">
+  <w:style w:type="table" w:styleId="751">
     <w:name w:val="Grid Table 7 Colorful - Accent 1"/>
-    <w:basedOn w:val="665"/>
+    <w:basedOn w:val="887"/>
     <w:uiPriority w:val="99"/>
     <w:pPr>
       <w:pBdr/>
@@ -11970,11 +12039,11 @@
         <w:tblBorders/>
       </w:tblPr>
       <w:tcPr>
-        <w:shd w:color="ffffff"/>
+        <w:shd w:val="clear" w:color="ffffff"/>
         <w:tcBorders>
-          <w:top w:val="none"/>
-          <w:left w:val="none"/>
-          <w:bottom w:val="none"/>
+          <w:top w:val="none" w:color="000000" w:sz="4" w:space="0"/>
+          <w:left w:val="none" w:color="000000" w:sz="4" w:space="0"/>
+          <w:bottom w:val="none" w:color="000000" w:sz="4" w:space="0"/>
           <w:right w:val="single" w:color="000000" w:themeColor="accent1" w:themeTint="80" w:sz="4" w:space="0"/>
         </w:tcBorders>
       </w:tcPr>
@@ -11997,10 +12066,10 @@
       <w:tcPr>
         <w:shd w:val="clear" w:color="ffffff" w:themeColor="light1" w:fill="ffffff" w:themeFill="light1"/>
         <w:tcBorders>
-          <w:top w:val="none"/>
-          <w:left w:val="none"/>
+          <w:top w:val="none" w:color="000000" w:sz="4" w:space="0"/>
+          <w:left w:val="none" w:color="000000" w:sz="4" w:space="0"/>
           <w:bottom w:val="single" w:color="000000" w:themeColor="accent1" w:themeTint="80" w:sz="4" w:space="0"/>
-          <w:right w:val="none"/>
+          <w:right w:val="none" w:color="000000" w:sz="4" w:space="0"/>
         </w:tcBorders>
       </w:tcPr>
     </w:tblStylePr>
@@ -12020,12 +12089,12 @@
         <w:tblBorders/>
       </w:tblPr>
       <w:tcPr>
-        <w:shd w:color="ffffff"/>
+        <w:shd w:val="clear" w:color="ffffff"/>
         <w:tcBorders>
-          <w:top w:val="none"/>
+          <w:top w:val="none" w:color="000000" w:sz="4" w:space="0"/>
           <w:left w:val="single" w:color="000000" w:themeColor="accent1" w:themeTint="80" w:sz="4" w:space="0"/>
-          <w:bottom w:val="none"/>
-          <w:right w:val="none"/>
+          <w:bottom w:val="none" w:color="000000" w:sz="4" w:space="0"/>
+          <w:right w:val="none" w:color="000000" w:sz="4" w:space="0"/>
         </w:tcBorders>
       </w:tcPr>
     </w:tblStylePr>
@@ -12048,9 +12117,9 @@
         <w:shd w:val="clear" w:color="ffffff" w:themeColor="light1" w:fill="ffffff" w:themeFill="light1"/>
         <w:tcBorders>
           <w:top w:val="single" w:color="000000" w:themeColor="accent1" w:themeTint="80" w:sz="4" w:space="0"/>
-          <w:left w:val="none"/>
-          <w:bottom w:val="none"/>
-          <w:right w:val="none"/>
+          <w:left w:val="none" w:color="000000" w:sz="4" w:space="0"/>
+          <w:bottom w:val="none" w:color="000000" w:sz="4" w:space="0"/>
+          <w:right w:val="none" w:color="000000" w:sz="4" w:space="0"/>
         </w:tcBorders>
       </w:tcPr>
     </w:tblStylePr>
@@ -12120,9 +12189,9 @@
       </w:tcPr>
     </w:tblStylePr>
   </w:style>
-  <w:style w:type="table" w:styleId="63">
+  <w:style w:type="table" w:styleId="752">
     <w:name w:val="Grid Table 7 Colorful - Accent 2"/>
-    <w:basedOn w:val="665"/>
+    <w:basedOn w:val="887"/>
     <w:uiPriority w:val="99"/>
     <w:pPr>
       <w:pBdr/>
@@ -12224,11 +12293,11 @@
         <w:tblBorders/>
       </w:tblPr>
       <w:tcPr>
-        <w:shd w:color="ffffff"/>
+        <w:shd w:val="clear" w:color="ffffff"/>
         <w:tcBorders>
-          <w:top w:val="none"/>
-          <w:left w:val="none"/>
-          <w:bottom w:val="none"/>
+          <w:top w:val="none" w:color="000000" w:sz="4" w:space="0"/>
+          <w:left w:val="none" w:color="000000" w:sz="4" w:space="0"/>
+          <w:bottom w:val="none" w:color="000000" w:sz="4" w:space="0"/>
           <w:right w:val="single" w:color="000000" w:themeColor="accent2" w:themeTint="97" w:sz="4" w:space="0"/>
         </w:tcBorders>
       </w:tcPr>
@@ -12251,10 +12320,10 @@
       <w:tcPr>
         <w:shd w:val="clear" w:color="ffffff" w:themeColor="light1" w:fill="ffffff" w:themeFill="light1"/>
         <w:tcBorders>
-          <w:top w:val="none"/>
-          <w:left w:val="none"/>
+          <w:top w:val="none" w:color="000000" w:sz="4" w:space="0"/>
+          <w:left w:val="none" w:color="000000" w:sz="4" w:space="0"/>
           <w:bottom w:val="single" w:color="000000" w:themeColor="accent2" w:themeTint="97" w:sz="4" w:space="0"/>
-          <w:right w:val="none"/>
+          <w:right w:val="none" w:color="000000" w:sz="4" w:space="0"/>
         </w:tcBorders>
       </w:tcPr>
     </w:tblStylePr>
@@ -12274,12 +12343,12 @@
         <w:tblBorders/>
       </w:tblPr>
       <w:tcPr>
-        <w:shd w:color="ffffff"/>
+        <w:shd w:val="clear" w:color="ffffff"/>
         <w:tcBorders>
-          <w:top w:val="none"/>
+          <w:top w:val="none" w:color="000000" w:sz="4" w:space="0"/>
           <w:left w:val="single" w:color="000000" w:themeColor="accent2" w:themeTint="97" w:sz="4" w:space="0"/>
-          <w:bottom w:val="none"/>
-          <w:right w:val="none"/>
+          <w:bottom w:val="none" w:color="000000" w:sz="4" w:space="0"/>
+          <w:right w:val="none" w:color="000000" w:sz="4" w:space="0"/>
         </w:tcBorders>
       </w:tcPr>
     </w:tblStylePr>
@@ -12302,9 +12371,9 @@
         <w:shd w:val="clear" w:color="ffffff" w:themeColor="light1" w:fill="ffffff" w:themeFill="light1"/>
         <w:tcBorders>
           <w:top w:val="single" w:color="000000" w:themeColor="accent2" w:themeTint="97" w:sz="4" w:space="0"/>
-          <w:left w:val="none"/>
-          <w:bottom w:val="none"/>
-          <w:right w:val="none"/>
+          <w:left w:val="none" w:color="000000" w:sz="4" w:space="0"/>
+          <w:bottom w:val="none" w:color="000000" w:sz="4" w:space="0"/>
+          <w:right w:val="none" w:color="000000" w:sz="4" w:space="0"/>
         </w:tcBorders>
       </w:tcPr>
     </w:tblStylePr>
@@ -12374,9 +12443,9 @@
       </w:tcPr>
     </w:tblStylePr>
   </w:style>
-  <w:style w:type="table" w:styleId="64">
+  <w:style w:type="table" w:styleId="753">
     <w:name w:val="Grid Table 7 Colorful - Accent 3"/>
-    <w:basedOn w:val="665"/>
+    <w:basedOn w:val="887"/>
     <w:uiPriority w:val="99"/>
     <w:pPr>
       <w:pBdr/>
@@ -12478,11 +12547,11 @@
         <w:tblBorders/>
       </w:tblPr>
       <w:tcPr>
-        <w:shd w:color="ffffff"/>
+        <w:shd w:val="clear" w:color="ffffff"/>
         <w:tcBorders>
-          <w:top w:val="none"/>
-          <w:left w:val="none"/>
-          <w:bottom w:val="none"/>
+          <w:top w:val="none" w:color="000000" w:sz="4" w:space="0"/>
+          <w:left w:val="none" w:color="000000" w:sz="4" w:space="0"/>
+          <w:bottom w:val="none" w:color="000000" w:sz="4" w:space="0"/>
           <w:right w:val="single" w:color="000000" w:themeColor="accent3" w:themeTint="FE" w:sz="4" w:space="0"/>
         </w:tcBorders>
       </w:tcPr>
@@ -12505,10 +12574,10 @@
       <w:tcPr>
         <w:shd w:val="clear" w:color="ffffff" w:themeColor="light1" w:fill="ffffff" w:themeFill="light1"/>
         <w:tcBorders>
-          <w:top w:val="none"/>
-          <w:left w:val="none"/>
+          <w:top w:val="none" w:color="000000" w:sz="4" w:space="0"/>
+          <w:left w:val="none" w:color="000000" w:sz="4" w:space="0"/>
           <w:bottom w:val="single" w:color="000000" w:themeColor="accent3" w:themeTint="FE" w:sz="4" w:space="0"/>
-          <w:right w:val="none"/>
+          <w:right w:val="none" w:color="000000" w:sz="4" w:space="0"/>
         </w:tcBorders>
       </w:tcPr>
     </w:tblStylePr>
@@ -12528,12 +12597,12 @@
         <w:tblBorders/>
       </w:tblPr>
       <w:tcPr>
-        <w:shd w:color="ffffff"/>
+        <w:shd w:val="clear" w:color="ffffff"/>
         <w:tcBorders>
-          <w:top w:val="none"/>
+          <w:top w:val="none" w:color="000000" w:sz="4" w:space="0"/>
           <w:left w:val="single" w:color="000000" w:themeColor="accent3" w:themeTint="FE" w:sz="4" w:space="0"/>
-          <w:bottom w:val="none"/>
-          <w:right w:val="none"/>
+          <w:bottom w:val="none" w:color="000000" w:sz="4" w:space="0"/>
+          <w:right w:val="none" w:color="000000" w:sz="4" w:space="0"/>
         </w:tcBorders>
       </w:tcPr>
     </w:tblStylePr>
@@ -12556,9 +12625,9 @@
         <w:shd w:val="clear" w:color="ffffff" w:themeColor="light1" w:fill="ffffff" w:themeFill="light1"/>
         <w:tcBorders>
           <w:top w:val="single" w:color="000000" w:themeColor="accent3" w:themeTint="FE" w:sz="4" w:space="0"/>
-          <w:left w:val="none"/>
-          <w:bottom w:val="none"/>
-          <w:right w:val="none"/>
+          <w:left w:val="none" w:color="000000" w:sz="4" w:space="0"/>
+          <w:bottom w:val="none" w:color="000000" w:sz="4" w:space="0"/>
+          <w:right w:val="none" w:color="000000" w:sz="4" w:space="0"/>
         </w:tcBorders>
       </w:tcPr>
     </w:tblStylePr>
@@ -12628,9 +12697,9 @@
       </w:tcPr>
     </w:tblStylePr>
   </w:style>
-  <w:style w:type="table" w:styleId="65">
+  <w:style w:type="table" w:styleId="754">
     <w:name w:val="Grid Table 7 Colorful - Accent 4"/>
-    <w:basedOn w:val="665"/>
+    <w:basedOn w:val="887"/>
     <w:uiPriority w:val="99"/>
     <w:pPr>
       <w:pBdr/>
@@ -12732,11 +12801,11 @@
         <w:tblBorders/>
       </w:tblPr>
       <w:tcPr>
-        <w:shd w:color="ffffff"/>
+        <w:shd w:val="clear" w:color="ffffff"/>
         <w:tcBorders>
-          <w:top w:val="none"/>
-          <w:left w:val="none"/>
-          <w:bottom w:val="none"/>
+          <w:top w:val="none" w:color="000000" w:sz="4" w:space="0"/>
+          <w:left w:val="none" w:color="000000" w:sz="4" w:space="0"/>
+          <w:bottom w:val="none" w:color="000000" w:sz="4" w:space="0"/>
           <w:right w:val="single" w:color="000000" w:themeColor="accent4" w:themeTint="9A" w:sz="4" w:space="0"/>
         </w:tcBorders>
       </w:tcPr>
@@ -12759,10 +12828,10 @@
       <w:tcPr>
         <w:shd w:val="clear" w:color="ffffff" w:themeColor="light1" w:fill="ffffff" w:themeFill="light1"/>
         <w:tcBorders>
-          <w:top w:val="none"/>
-          <w:left w:val="none"/>
+          <w:top w:val="none" w:color="000000" w:sz="4" w:space="0"/>
+          <w:left w:val="none" w:color="000000" w:sz="4" w:space="0"/>
           <w:bottom w:val="single" w:color="000000" w:themeColor="accent4" w:themeTint="9A" w:sz="4" w:space="0"/>
-          <w:right w:val="none"/>
+          <w:right w:val="none" w:color="000000" w:sz="4" w:space="0"/>
         </w:tcBorders>
       </w:tcPr>
     </w:tblStylePr>
@@ -12782,12 +12851,12 @@
         <w:tblBorders/>
       </w:tblPr>
       <w:tcPr>
-        <w:shd w:color="ffffff"/>
+        <w:shd w:val="clear" w:color="ffffff"/>
         <w:tcBorders>
-          <w:top w:val="none"/>
+          <w:top w:val="none" w:color="000000" w:sz="4" w:space="0"/>
           <w:left w:val="single" w:color="000000" w:themeColor="accent4" w:themeTint="9A" w:sz="4" w:space="0"/>
-          <w:bottom w:val="none"/>
-          <w:right w:val="none"/>
+          <w:bottom w:val="none" w:color="000000" w:sz="4" w:space="0"/>
+          <w:right w:val="none" w:color="000000" w:sz="4" w:space="0"/>
         </w:tcBorders>
       </w:tcPr>
     </w:tblStylePr>
@@ -12810,9 +12879,9 @@
         <w:shd w:val="clear" w:color="ffffff" w:themeColor="light1" w:fill="ffffff" w:themeFill="light1"/>
         <w:tcBorders>
           <w:top w:val="single" w:color="000000" w:themeColor="accent4" w:themeTint="9A" w:sz="4" w:space="0"/>
-          <w:left w:val="none"/>
-          <w:bottom w:val="none"/>
-          <w:right w:val="none"/>
+          <w:left w:val="none" w:color="000000" w:sz="4" w:space="0"/>
+          <w:bottom w:val="none" w:color="000000" w:sz="4" w:space="0"/>
+          <w:right w:val="none" w:color="000000" w:sz="4" w:space="0"/>
         </w:tcBorders>
       </w:tcPr>
     </w:tblStylePr>
@@ -12882,9 +12951,9 @@
       </w:tcPr>
     </w:tblStylePr>
   </w:style>
-  <w:style w:type="table" w:styleId="66">
+  <w:style w:type="table" w:styleId="755">
     <w:name w:val="Grid Table 7 Colorful - Accent 5"/>
-    <w:basedOn w:val="665"/>
+    <w:basedOn w:val="887"/>
     <w:uiPriority w:val="99"/>
     <w:pPr>
       <w:pBdr/>
@@ -12986,11 +13055,11 @@
         <w:tblBorders/>
       </w:tblPr>
       <w:tcPr>
-        <w:shd w:color="ffffff"/>
+        <w:shd w:val="clear" w:color="ffffff"/>
         <w:tcBorders>
-          <w:top w:val="none"/>
-          <w:left w:val="none"/>
-          <w:bottom w:val="none"/>
+          <w:top w:val="none" w:color="000000" w:sz="4" w:space="0"/>
+          <w:left w:val="none" w:color="000000" w:sz="4" w:space="0"/>
+          <w:bottom w:val="none" w:color="000000" w:sz="4" w:space="0"/>
           <w:right w:val="single" w:color="000000" w:themeColor="accent5" w:themeTint="90" w:sz="4" w:space="0"/>
         </w:tcBorders>
       </w:tcPr>
@@ -13013,10 +13082,10 @@
       <w:tcPr>
         <w:shd w:val="clear" w:color="ffffff" w:themeColor="light1" w:fill="ffffff" w:themeFill="light1"/>
         <w:tcBorders>
-          <w:top w:val="none"/>
-          <w:left w:val="none"/>
+          <w:top w:val="none" w:color="000000" w:sz="4" w:space="0"/>
+          <w:left w:val="none" w:color="000000" w:sz="4" w:space="0"/>
           <w:bottom w:val="single" w:color="000000" w:themeColor="accent5" w:themeTint="90" w:sz="4" w:space="0"/>
-          <w:right w:val="none"/>
+          <w:right w:val="none" w:color="000000" w:sz="4" w:space="0"/>
         </w:tcBorders>
       </w:tcPr>
     </w:tblStylePr>
@@ -13036,12 +13105,12 @@
         <w:tblBorders/>
       </w:tblPr>
       <w:tcPr>
-        <w:shd w:color="ffffff"/>
+        <w:shd w:val="clear" w:color="ffffff"/>
         <w:tcBorders>
-          <w:top w:val="none"/>
+          <w:top w:val="none" w:color="000000" w:sz="4" w:space="0"/>
           <w:left w:val="single" w:color="000000" w:themeColor="accent5" w:themeTint="90" w:sz="4" w:space="0"/>
-          <w:bottom w:val="none"/>
-          <w:right w:val="none"/>
+          <w:bottom w:val="none" w:color="000000" w:sz="4" w:space="0"/>
+          <w:right w:val="none" w:color="000000" w:sz="4" w:space="0"/>
         </w:tcBorders>
       </w:tcPr>
     </w:tblStylePr>
@@ -13064,9 +13133,9 @@
         <w:shd w:val="clear" w:color="ffffff" w:themeColor="light1" w:fill="ffffff" w:themeFill="light1"/>
         <w:tcBorders>
           <w:top w:val="single" w:color="000000" w:themeColor="accent5" w:themeTint="90" w:sz="4" w:space="0"/>
-          <w:left w:val="none"/>
-          <w:bottom w:val="none"/>
-          <w:right w:val="none"/>
+          <w:left w:val="none" w:color="000000" w:sz="4" w:space="0"/>
+          <w:bottom w:val="none" w:color="000000" w:sz="4" w:space="0"/>
+          <w:right w:val="none" w:color="000000" w:sz="4" w:space="0"/>
         </w:tcBorders>
       </w:tcPr>
     </w:tblStylePr>
@@ -13136,9 +13205,9 @@
       </w:tcPr>
     </w:tblStylePr>
   </w:style>
-  <w:style w:type="table" w:styleId="67">
+  <w:style w:type="table" w:styleId="756">
     <w:name w:val="Grid Table 7 Colorful - Accent 6"/>
-    <w:basedOn w:val="665"/>
+    <w:basedOn w:val="887"/>
     <w:uiPriority w:val="99"/>
     <w:pPr>
       <w:pBdr/>
@@ -13240,11 +13309,11 @@
         <w:tblBorders/>
       </w:tblPr>
       <w:tcPr>
-        <w:shd w:color="ffffff"/>
+        <w:shd w:val="clear" w:color="ffffff"/>
         <w:tcBorders>
-          <w:top w:val="none"/>
-          <w:left w:val="none"/>
-          <w:bottom w:val="none"/>
+          <w:top w:val="none" w:color="000000" w:sz="4" w:space="0"/>
+          <w:left w:val="none" w:color="000000" w:sz="4" w:space="0"/>
+          <w:bottom w:val="none" w:color="000000" w:sz="4" w:space="0"/>
           <w:right w:val="single" w:color="000000" w:themeColor="accent6" w:themeTint="90" w:sz="4" w:space="0"/>
         </w:tcBorders>
       </w:tcPr>
@@ -13267,10 +13336,10 @@
       <w:tcPr>
         <w:shd w:val="clear" w:color="ffffff" w:themeColor="light1" w:fill="ffffff" w:themeFill="light1"/>
         <w:tcBorders>
-          <w:top w:val="none"/>
-          <w:left w:val="none"/>
+          <w:top w:val="none" w:color="000000" w:sz="4" w:space="0"/>
+          <w:left w:val="none" w:color="000000" w:sz="4" w:space="0"/>
           <w:bottom w:val="single" w:color="000000" w:themeColor="accent6" w:themeTint="90" w:sz="4" w:space="0"/>
-          <w:right w:val="none"/>
+          <w:right w:val="none" w:color="000000" w:sz="4" w:space="0"/>
         </w:tcBorders>
       </w:tcPr>
     </w:tblStylePr>
@@ -13290,12 +13359,12 @@
         <w:tblBorders/>
       </w:tblPr>
       <w:tcPr>
-        <w:shd w:color="ffffff"/>
+        <w:shd w:val="clear" w:color="ffffff"/>
         <w:tcBorders>
-          <w:top w:val="none"/>
+          <w:top w:val="none" w:color="000000" w:sz="4" w:space="0"/>
           <w:left w:val="single" w:color="000000" w:themeColor="accent6" w:themeTint="90" w:sz="4" w:space="0"/>
-          <w:bottom w:val="none"/>
-          <w:right w:val="none"/>
+          <w:bottom w:val="none" w:color="000000" w:sz="4" w:space="0"/>
+          <w:right w:val="none" w:color="000000" w:sz="4" w:space="0"/>
         </w:tcBorders>
       </w:tcPr>
     </w:tblStylePr>
@@ -13318,9 +13387,9 @@
         <w:shd w:val="clear" w:color="ffffff" w:themeColor="light1" w:fill="ffffff" w:themeFill="light1"/>
         <w:tcBorders>
           <w:top w:val="single" w:color="000000" w:themeColor="accent6" w:themeTint="90" w:sz="4" w:space="0"/>
-          <w:left w:val="none"/>
-          <w:bottom w:val="none"/>
-          <w:right w:val="none"/>
+          <w:left w:val="none" w:color="000000" w:sz="4" w:space="0"/>
+          <w:bottom w:val="none" w:color="000000" w:sz="4" w:space="0"/>
+          <w:right w:val="none" w:color="000000" w:sz="4" w:space="0"/>
         </w:tcBorders>
       </w:tcPr>
     </w:tblStylePr>
@@ -13390,9 +13459,9 @@
       </w:tcPr>
     </w:tblStylePr>
   </w:style>
-  <w:style w:type="table" w:styleId="68">
+  <w:style w:type="table" w:styleId="757">
     <w:name w:val="List Table 1 Light"/>
-    <w:basedOn w:val="665"/>
+    <w:basedOn w:val="887"/>
     <w:uiPriority w:val="99"/>
     <w:pPr>
       <w:pBdr/>
@@ -13606,9 +13675,9 @@
       </w:tcPr>
     </w:tblStylePr>
   </w:style>
-  <w:style w:type="table" w:styleId="69">
+  <w:style w:type="table" w:styleId="758">
     <w:name w:val="List Table 1 Light - Accent 1"/>
-    <w:basedOn w:val="665"/>
+    <w:basedOn w:val="887"/>
     <w:uiPriority w:val="99"/>
     <w:pPr>
       <w:pBdr/>
@@ -13822,9 +13891,9 @@
       </w:tcPr>
     </w:tblStylePr>
   </w:style>
-  <w:style w:type="table" w:styleId="70">
+  <w:style w:type="table" w:styleId="759">
     <w:name w:val="List Table 1 Light - Accent 2"/>
-    <w:basedOn w:val="665"/>
+    <w:basedOn w:val="887"/>
     <w:uiPriority w:val="99"/>
     <w:pPr>
       <w:pBdr/>
@@ -14038,9 +14107,9 @@
       </w:tcPr>
     </w:tblStylePr>
   </w:style>
-  <w:style w:type="table" w:styleId="71">
+  <w:style w:type="table" w:styleId="760">
     <w:name w:val="List Table 1 Light - Accent 3"/>
-    <w:basedOn w:val="665"/>
+    <w:basedOn w:val="887"/>
     <w:uiPriority w:val="99"/>
     <w:pPr>
       <w:pBdr/>
@@ -14254,9 +14323,9 @@
       </w:tcPr>
     </w:tblStylePr>
   </w:style>
-  <w:style w:type="table" w:styleId="72">
+  <w:style w:type="table" w:styleId="761">
     <w:name w:val="List Table 1 Light - Accent 4"/>
-    <w:basedOn w:val="665"/>
+    <w:basedOn w:val="887"/>
     <w:uiPriority w:val="99"/>
     <w:pPr>
       <w:pBdr/>
@@ -14470,9 +14539,9 @@
       </w:tcPr>
     </w:tblStylePr>
   </w:style>
-  <w:style w:type="table" w:styleId="73">
+  <w:style w:type="table" w:styleId="762">
     <w:name w:val="List Table 1 Light - Accent 5"/>
-    <w:basedOn w:val="665"/>
+    <w:basedOn w:val="887"/>
     <w:uiPriority w:val="99"/>
     <w:pPr>
       <w:pBdr/>
@@ -14686,9 +14755,9 @@
       </w:tcPr>
     </w:tblStylePr>
   </w:style>
-  <w:style w:type="table" w:styleId="74">
+  <w:style w:type="table" w:styleId="763">
     <w:name w:val="List Table 1 Light - Accent 6"/>
-    <w:basedOn w:val="665"/>
+    <w:basedOn w:val="887"/>
     <w:uiPriority w:val="99"/>
     <w:pPr>
       <w:pBdr/>
@@ -14902,9 +14971,9 @@
       </w:tcPr>
     </w:tblStylePr>
   </w:style>
-  <w:style w:type="table" w:styleId="75">
+  <w:style w:type="table" w:styleId="764">
     <w:name w:val="List Table 2"/>
-    <w:basedOn w:val="665"/>
+    <w:basedOn w:val="887"/>
     <w:uiPriority w:val="99"/>
     <w:pPr>
       <w:pBdr/>
@@ -15140,9 +15209,9 @@
       </w:tcPr>
     </w:tblStylePr>
   </w:style>
-  <w:style w:type="table" w:styleId="76">
+  <w:style w:type="table" w:styleId="765">
     <w:name w:val="List Table 2 - Accent 1"/>
-    <w:basedOn w:val="665"/>
+    <w:basedOn w:val="887"/>
     <w:uiPriority w:val="99"/>
     <w:pPr>
       <w:pBdr/>
@@ -15378,9 +15447,9 @@
       </w:tcPr>
     </w:tblStylePr>
   </w:style>
-  <w:style w:type="table" w:styleId="77">
+  <w:style w:type="table" w:styleId="766">
     <w:name w:val="List Table 2 - Accent 2"/>
-    <w:basedOn w:val="665"/>
+    <w:basedOn w:val="887"/>
     <w:uiPriority w:val="99"/>
     <w:pPr>
       <w:pBdr/>
@@ -15616,9 +15685,9 @@
       </w:tcPr>
     </w:tblStylePr>
   </w:style>
-  <w:style w:type="table" w:styleId="78">
+  <w:style w:type="table" w:styleId="767">
     <w:name w:val="List Table 2 - Accent 3"/>
-    <w:basedOn w:val="665"/>
+    <w:basedOn w:val="887"/>
     <w:uiPriority w:val="99"/>
     <w:pPr>
       <w:pBdr/>
@@ -15854,9 +15923,9 @@
       </w:tcPr>
     </w:tblStylePr>
   </w:style>
-  <w:style w:type="table" w:styleId="79">
+  <w:style w:type="table" w:styleId="768">
     <w:name w:val="List Table 2 - Accent 4"/>
-    <w:basedOn w:val="665"/>
+    <w:basedOn w:val="887"/>
     <w:uiPriority w:val="99"/>
     <w:pPr>
       <w:pBdr/>
@@ -16092,9 +16161,9 @@
       </w:tcPr>
     </w:tblStylePr>
   </w:style>
-  <w:style w:type="table" w:styleId="80">
+  <w:style w:type="table" w:styleId="769">
     <w:name w:val="List Table 2 - Accent 5"/>
-    <w:basedOn w:val="665"/>
+    <w:basedOn w:val="887"/>
     <w:uiPriority w:val="99"/>
     <w:pPr>
       <w:pBdr/>
@@ -16330,9 +16399,9 @@
       </w:tcPr>
     </w:tblStylePr>
   </w:style>
-  <w:style w:type="table" w:styleId="81">
+  <w:style w:type="table" w:styleId="770">
     <w:name w:val="List Table 2 - Accent 6"/>
-    <w:basedOn w:val="665"/>
+    <w:basedOn w:val="887"/>
     <w:uiPriority w:val="99"/>
     <w:pPr>
       <w:pBdr/>
@@ -16568,9 +16637,9 @@
       </w:tcPr>
     </w:tblStylePr>
   </w:style>
-  <w:style w:type="table" w:styleId="82">
+  <w:style w:type="table" w:styleId="771">
     <w:name w:val="List Table 3"/>
-    <w:basedOn w:val="665"/>
+    <w:basedOn w:val="887"/>
     <w:uiPriority w:val="99"/>
     <w:pPr>
       <w:pBdr/>
@@ -16796,9 +16865,9 @@
       </w:tcPr>
     </w:tblStylePr>
   </w:style>
-  <w:style w:type="table" w:styleId="83">
+  <w:style w:type="table" w:styleId="772">
     <w:name w:val="List Table 3 - Accent 1"/>
-    <w:basedOn w:val="665"/>
+    <w:basedOn w:val="887"/>
     <w:uiPriority w:val="99"/>
     <w:pPr>
       <w:pBdr/>
@@ -17024,9 +17093,9 @@
       </w:tcPr>
     </w:tblStylePr>
   </w:style>
-  <w:style w:type="table" w:styleId="84">
+  <w:style w:type="table" w:styleId="773">
     <w:name w:val="List Table 3 - Accent 2"/>
-    <w:basedOn w:val="665"/>
+    <w:basedOn w:val="887"/>
     <w:uiPriority w:val="99"/>
     <w:pPr>
       <w:pBdr/>
@@ -17252,9 +17321,9 @@
       </w:tcPr>
     </w:tblStylePr>
   </w:style>
-  <w:style w:type="table" w:styleId="85">
+  <w:style w:type="table" w:styleId="774">
     <w:name w:val="List Table 3 - Accent 3"/>
-    <w:basedOn w:val="665"/>
+    <w:basedOn w:val="887"/>
     <w:uiPriority w:val="99"/>
     <w:pPr>
       <w:pBdr/>
@@ -17480,9 +17549,9 @@
       </w:tcPr>
     </w:tblStylePr>
   </w:style>
-  <w:style w:type="table" w:styleId="86">
+  <w:style w:type="table" w:styleId="775">
     <w:name w:val="List Table 3 - Accent 4"/>
-    <w:basedOn w:val="665"/>
+    <w:basedOn w:val="887"/>
     <w:uiPriority w:val="99"/>
     <w:pPr>
       <w:pBdr/>
@@ -17708,9 +17777,9 @@
       </w:tcPr>
     </w:tblStylePr>
   </w:style>
-  <w:style w:type="table" w:styleId="87">
+  <w:style w:type="table" w:styleId="776">
     <w:name w:val="List Table 3 - Accent 5"/>
-    <w:basedOn w:val="665"/>
+    <w:basedOn w:val="887"/>
     <w:uiPriority w:val="99"/>
     <w:pPr>
       <w:pBdr/>
@@ -17936,9 +18005,9 @@
       </w:tcPr>
     </w:tblStylePr>
   </w:style>
-  <w:style w:type="table" w:styleId="88">
+  <w:style w:type="table" w:styleId="777">
     <w:name w:val="List Table 3 - Accent 6"/>
-    <w:basedOn w:val="665"/>
+    <w:basedOn w:val="887"/>
     <w:uiPriority w:val="99"/>
     <w:pPr>
       <w:pBdr/>
@@ -18164,9 +18233,9 @@
       </w:tcPr>
     </w:tblStylePr>
   </w:style>
-  <w:style w:type="table" w:styleId="89">
+  <w:style w:type="table" w:styleId="778">
     <w:name w:val="List Table 4"/>
-    <w:basedOn w:val="665"/>
+    <w:basedOn w:val="887"/>
     <w:uiPriority w:val="99"/>
     <w:pPr>
       <w:pBdr/>
@@ -18389,9 +18458,9 @@
       </w:tcPr>
     </w:tblStylePr>
   </w:style>
-  <w:style w:type="table" w:styleId="90">
+  <w:style w:type="table" w:styleId="779">
     <w:name w:val="List Table 4 - Accent 1"/>
-    <w:basedOn w:val="665"/>
+    <w:basedOn w:val="887"/>
     <w:uiPriority w:val="99"/>
     <w:pPr>
       <w:pBdr/>
@@ -18614,9 +18683,9 @@
       </w:tcPr>
     </w:tblStylePr>
   </w:style>
-  <w:style w:type="table" w:styleId="91">
+  <w:style w:type="table" w:styleId="780">
     <w:name w:val="List Table 4 - Accent 2"/>
-    <w:basedOn w:val="665"/>
+    <w:basedOn w:val="887"/>
     <w:uiPriority w:val="99"/>
     <w:pPr>
       <w:pBdr/>
@@ -18839,9 +18908,9 @@
       </w:tcPr>
     </w:tblStylePr>
   </w:style>
-  <w:style w:type="table" w:styleId="92">
+  <w:style w:type="table" w:styleId="781">
     <w:name w:val="List Table 4 - Accent 3"/>
-    <w:basedOn w:val="665"/>
+    <w:basedOn w:val="887"/>
     <w:uiPriority w:val="99"/>
     <w:pPr>
       <w:pBdr/>
@@ -19064,9 +19133,9 @@
       </w:tcPr>
     </w:tblStylePr>
   </w:style>
-  <w:style w:type="table" w:styleId="93">
+  <w:style w:type="table" w:styleId="782">
     <w:name w:val="List Table 4 - Accent 4"/>
-    <w:basedOn w:val="665"/>
+    <w:basedOn w:val="887"/>
     <w:uiPriority w:val="99"/>
     <w:pPr>
       <w:pBdr/>
@@ -19289,9 +19358,9 @@
       </w:tcPr>
     </w:tblStylePr>
   </w:style>
-  <w:style w:type="table" w:styleId="94">
+  <w:style w:type="table" w:styleId="783">
     <w:name w:val="List Table 4 - Accent 5"/>
-    <w:basedOn w:val="665"/>
+    <w:basedOn w:val="887"/>
     <w:uiPriority w:val="99"/>
     <w:pPr>
       <w:pBdr/>
@@ -19514,9 +19583,9 @@
       </w:tcPr>
     </w:tblStylePr>
   </w:style>
-  <w:style w:type="table" w:styleId="95">
+  <w:style w:type="table" w:styleId="784">
     <w:name w:val="List Table 4 - Accent 6"/>
-    <w:basedOn w:val="665"/>
+    <w:basedOn w:val="887"/>
     <w:uiPriority w:val="99"/>
     <w:pPr>
       <w:pBdr/>
@@ -19739,9 +19808,9 @@
       </w:tcPr>
     </w:tblStylePr>
   </w:style>
-  <w:style w:type="table" w:styleId="96">
+  <w:style w:type="table" w:styleId="785">
     <w:name w:val="List Table 5 Dark"/>
-    <w:basedOn w:val="665"/>
+    <w:basedOn w:val="887"/>
     <w:uiPriority w:val="99"/>
     <w:pPr>
       <w:pBdr/>
@@ -19981,9 +20050,9 @@
       </w:tcPr>
     </w:tblStylePr>
   </w:style>
-  <w:style w:type="table" w:styleId="97">
+  <w:style w:type="table" w:styleId="786">
     <w:name w:val="List Table 5 Dark - Accent 1"/>
-    <w:basedOn w:val="665"/>
+    <w:basedOn w:val="887"/>
     <w:uiPriority w:val="99"/>
     <w:pPr>
       <w:pBdr/>
@@ -20223,9 +20292,9 @@
       </w:tcPr>
     </w:tblStylePr>
   </w:style>
-  <w:style w:type="table" w:styleId="98">
+  <w:style w:type="table" w:styleId="787">
     <w:name w:val="List Table 5 Dark - Accent 2"/>
-    <w:basedOn w:val="665"/>
+    <w:basedOn w:val="887"/>
     <w:uiPriority w:val="99"/>
     <w:pPr>
       <w:pBdr/>
@@ -20465,9 +20534,9 @@
       </w:tcPr>
     </w:tblStylePr>
   </w:style>
-  <w:style w:type="table" w:styleId="99">
+  <w:style w:type="table" w:styleId="788">
     <w:name w:val="List Table 5 Dark - Accent 3"/>
-    <w:basedOn w:val="665"/>
+    <w:basedOn w:val="887"/>
     <w:uiPriority w:val="99"/>
     <w:pPr>
       <w:pBdr/>
@@ -20707,9 +20776,9 @@
       </w:tcPr>
     </w:tblStylePr>
   </w:style>
-  <w:style w:type="table" w:styleId="100">
+  <w:style w:type="table" w:styleId="789">
     <w:name w:val="List Table 5 Dark - Accent 4"/>
-    <w:basedOn w:val="665"/>
+    <w:basedOn w:val="887"/>
     <w:uiPriority w:val="99"/>
     <w:pPr>
       <w:pBdr/>
@@ -20949,9 +21018,9 @@
       </w:tcPr>
     </w:tblStylePr>
   </w:style>
-  <w:style w:type="table" w:styleId="101">
+  <w:style w:type="table" w:styleId="790">
     <w:name w:val="List Table 5 Dark - Accent 5"/>
-    <w:basedOn w:val="665"/>
+    <w:basedOn w:val="887"/>
     <w:uiPriority w:val="99"/>
     <w:pPr>
       <w:pBdr/>
@@ -21191,9 +21260,9 @@
       </w:tcPr>
     </w:tblStylePr>
   </w:style>
-  <w:style w:type="table" w:styleId="102">
+  <w:style w:type="table" w:styleId="791">
     <w:name w:val="List Table 5 Dark - Accent 6"/>
-    <w:basedOn w:val="665"/>
+    <w:basedOn w:val="887"/>
     <w:uiPriority w:val="99"/>
     <w:pPr>
       <w:pBdr/>
@@ -21433,9 +21502,9 @@
       </w:tcPr>
     </w:tblStylePr>
   </w:style>
-  <w:style w:type="table" w:styleId="103">
+  <w:style w:type="table" w:styleId="792">
     <w:name w:val="List Table 6 Colorful"/>
-    <w:basedOn w:val="665"/>
+    <w:basedOn w:val="887"/>
     <w:uiPriority w:val="99"/>
     <w:pPr>
       <w:pBdr/>
@@ -21656,9 +21725,9 @@
       </w:tcPr>
     </w:tblStylePr>
   </w:style>
-  <w:style w:type="table" w:styleId="104">
+  <w:style w:type="table" w:styleId="793">
     <w:name w:val="List Table 6 Colorful - Accent 1"/>
-    <w:basedOn w:val="665"/>
+    <w:basedOn w:val="887"/>
     <w:uiPriority w:val="99"/>
     <w:pPr>
       <w:pBdr/>
@@ -21879,9 +21948,9 @@
       </w:tcPr>
     </w:tblStylePr>
   </w:style>
-  <w:style w:type="table" w:styleId="105">
+  <w:style w:type="table" w:styleId="794">
     <w:name w:val="List Table 6 Colorful - Accent 2"/>
-    <w:basedOn w:val="665"/>
+    <w:basedOn w:val="887"/>
     <w:uiPriority w:val="99"/>
     <w:pPr>
       <w:pBdr/>
@@ -22102,9 +22171,9 @@
       </w:tcPr>
     </w:tblStylePr>
   </w:style>
-  <w:style w:type="table" w:styleId="106">
+  <w:style w:type="table" w:styleId="795">
     <w:name w:val="List Table 6 Colorful - Accent 3"/>
-    <w:basedOn w:val="665"/>
+    <w:basedOn w:val="887"/>
     <w:uiPriority w:val="99"/>
     <w:pPr>
       <w:pBdr/>
@@ -22325,9 +22394,9 @@
       </w:tcPr>
     </w:tblStylePr>
   </w:style>
-  <w:style w:type="table" w:styleId="107">
+  <w:style w:type="table" w:styleId="796">
     <w:name w:val="List Table 6 Colorful - Accent 4"/>
-    <w:basedOn w:val="665"/>
+    <w:basedOn w:val="887"/>
     <w:uiPriority w:val="99"/>
     <w:pPr>
       <w:pBdr/>
@@ -22548,9 +22617,9 @@
       </w:tcPr>
     </w:tblStylePr>
   </w:style>
-  <w:style w:type="table" w:styleId="108">
+  <w:style w:type="table" w:styleId="797">
     <w:name w:val="List Table 6 Colorful - Accent 5"/>
-    <w:basedOn w:val="665"/>
+    <w:basedOn w:val="887"/>
     <w:uiPriority w:val="99"/>
     <w:pPr>
       <w:pBdr/>
@@ -22771,9 +22840,9 @@
       </w:tcPr>
     </w:tblStylePr>
   </w:style>
-  <w:style w:type="table" w:styleId="109">
+  <w:style w:type="table" w:styleId="798">
     <w:name w:val="List Table 6 Colorful - Accent 6"/>
-    <w:basedOn w:val="665"/>
+    <w:basedOn w:val="887"/>
     <w:uiPriority w:val="99"/>
     <w:pPr>
       <w:pBdr/>
@@ -22994,9 +23063,9 @@
       </w:tcPr>
     </w:tblStylePr>
   </w:style>
-  <w:style w:type="table" w:styleId="110">
+  <w:style w:type="table" w:styleId="799">
     <w:name w:val="List Table 7 Colorful"/>
-    <w:basedOn w:val="665"/>
+    <w:basedOn w:val="887"/>
     <w:uiPriority w:val="99"/>
     <w:pPr>
       <w:pBdr/>
@@ -23095,11 +23164,11 @@
         <w:tblBorders/>
       </w:tblPr>
       <w:tcPr>
-        <w:shd w:color="ffffff"/>
+        <w:shd w:val="clear" w:color="ffffff"/>
         <w:tcBorders>
-          <w:top w:val="none"/>
-          <w:left w:val="none"/>
-          <w:bottom w:val="none"/>
+          <w:top w:val="none" w:color="000000" w:sz="4" w:space="0"/>
+          <w:left w:val="none" w:color="000000" w:sz="4" w:space="0"/>
+          <w:bottom w:val="none" w:color="000000" w:sz="4" w:space="0"/>
           <w:right w:val="single" w:color="000000" w:themeColor="text1" w:themeTint="80" w:sz="4" w:space="0"/>
         </w:tcBorders>
       </w:tcPr>
@@ -23122,10 +23191,10 @@
       <w:tcPr>
         <w:shd w:val="clear" w:color="ffffff" w:themeColor="light1" w:fill="ffffff" w:themeFill="light1"/>
         <w:tcBorders>
-          <w:top w:val="none"/>
-          <w:left w:val="none"/>
+          <w:top w:val="none" w:color="000000" w:sz="4" w:space="0"/>
+          <w:left w:val="none" w:color="000000" w:sz="4" w:space="0"/>
           <w:bottom w:val="single" w:color="000000" w:themeColor="text1" w:themeTint="80" w:sz="4" w:space="0"/>
-          <w:right w:val="none"/>
+          <w:right w:val="none" w:color="000000" w:sz="4" w:space="0"/>
         </w:tcBorders>
       </w:tcPr>
     </w:tblStylePr>
@@ -23145,12 +23214,12 @@
         <w:tblBorders/>
       </w:tblPr>
       <w:tcPr>
-        <w:shd w:color="ffffff"/>
+        <w:shd w:val="clear" w:color="ffffff"/>
         <w:tcBorders>
-          <w:top w:val="none"/>
+          <w:top w:val="none" w:color="000000" w:sz="4" w:space="0"/>
           <w:left w:val="single" w:color="000000" w:themeColor="text1" w:themeTint="80" w:sz="4" w:space="0"/>
-          <w:bottom w:val="none"/>
-          <w:right w:val="none"/>
+          <w:bottom w:val="none" w:color="000000" w:sz="4" w:space="0"/>
+          <w:right w:val="none" w:color="000000" w:sz="4" w:space="0"/>
         </w:tcBorders>
       </w:tcPr>
     </w:tblStylePr>
@@ -23173,9 +23242,9 @@
         <w:shd w:val="clear" w:color="ffffff" w:themeColor="light1" w:fill="ffffff" w:themeFill="light1"/>
         <w:tcBorders>
           <w:top w:val="single" w:color="000000" w:themeColor="text1" w:themeTint="80" w:sz="4" w:space="0"/>
-          <w:left w:val="none"/>
-          <w:bottom w:val="none"/>
-          <w:right w:val="none"/>
+          <w:left w:val="none" w:color="000000" w:sz="4" w:space="0"/>
+          <w:bottom w:val="none" w:color="000000" w:sz="4" w:space="0"/>
+          <w:right w:val="none" w:color="000000" w:sz="4" w:space="0"/>
         </w:tcBorders>
       </w:tcPr>
     </w:tblStylePr>
@@ -23250,9 +23319,9 @@
       </w:tcPr>
     </w:tblStylePr>
   </w:style>
-  <w:style w:type="table" w:styleId="111">
+  <w:style w:type="table" w:styleId="800">
     <w:name w:val="List Table 7 Colorful - Accent 1"/>
-    <w:basedOn w:val="665"/>
+    <w:basedOn w:val="887"/>
     <w:uiPriority w:val="99"/>
     <w:pPr>
       <w:pBdr/>
@@ -23351,11 +23420,11 @@
         <w:tblBorders/>
       </w:tblPr>
       <w:tcPr>
-        <w:shd w:color="ffffff"/>
+        <w:shd w:val="clear" w:color="ffffff"/>
         <w:tcBorders>
-          <w:top w:val="none"/>
-          <w:left w:val="none"/>
-          <w:bottom w:val="none"/>
+          <w:top w:val="none" w:color="000000" w:sz="4" w:space="0"/>
+          <w:left w:val="none" w:color="000000" w:sz="4" w:space="0"/>
+          <w:bottom w:val="none" w:color="000000" w:sz="4" w:space="0"/>
           <w:right w:val="single" w:color="000000" w:themeColor="accent1" w:sz="4" w:space="0"/>
         </w:tcBorders>
       </w:tcPr>
@@ -23378,10 +23447,10 @@
       <w:tcPr>
         <w:shd w:val="clear" w:color="ffffff" w:themeColor="light1" w:fill="ffffff" w:themeFill="light1"/>
         <w:tcBorders>
-          <w:top w:val="none"/>
-          <w:left w:val="none"/>
+          <w:top w:val="none" w:color="000000" w:sz="4" w:space="0"/>
+          <w:left w:val="none" w:color="000000" w:sz="4" w:space="0"/>
           <w:bottom w:val="single" w:color="000000" w:themeColor="accent1" w:sz="4" w:space="0"/>
-          <w:right w:val="none"/>
+          <w:right w:val="none" w:color="000000" w:sz="4" w:space="0"/>
         </w:tcBorders>
       </w:tcPr>
     </w:tblStylePr>
@@ -23401,12 +23470,12 @@
         <w:tblBorders/>
       </w:tblPr>
       <w:tcPr>
-        <w:shd w:color="ffffff"/>
+        <w:shd w:val="clear" w:color="ffffff"/>
         <w:tcBorders>
-          <w:top w:val="none"/>
+          <w:top w:val="none" w:color="000000" w:sz="4" w:space="0"/>
           <w:left w:val="single" w:color="000000" w:themeColor="accent1" w:sz="4" w:space="0"/>
-          <w:bottom w:val="none"/>
-          <w:right w:val="none"/>
+          <w:bottom w:val="none" w:color="000000" w:sz="4" w:space="0"/>
+          <w:right w:val="none" w:color="000000" w:sz="4" w:space="0"/>
         </w:tcBorders>
       </w:tcPr>
     </w:tblStylePr>
@@ -23429,9 +23498,9 @@
         <w:shd w:val="clear" w:color="ffffff" w:themeColor="light1" w:fill="ffffff" w:themeFill="light1"/>
         <w:tcBorders>
           <w:top w:val="single" w:color="000000" w:themeColor="accent1" w:sz="4" w:space="0"/>
-          <w:left w:val="none"/>
-          <w:bottom w:val="none"/>
-          <w:right w:val="none"/>
+          <w:left w:val="none" w:color="000000" w:sz="4" w:space="0"/>
+          <w:bottom w:val="none" w:color="000000" w:sz="4" w:space="0"/>
+          <w:right w:val="none" w:color="000000" w:sz="4" w:space="0"/>
         </w:tcBorders>
       </w:tcPr>
     </w:tblStylePr>
@@ -23506,9 +23575,9 @@
       </w:tcPr>
     </w:tblStylePr>
   </w:style>
-  <w:style w:type="table" w:styleId="112">
+  <w:style w:type="table" w:styleId="801">
     <w:name w:val="List Table 7 Colorful - Accent 2"/>
-    <w:basedOn w:val="665"/>
+    <w:basedOn w:val="887"/>
     <w:uiPriority w:val="99"/>
     <w:pPr>
       <w:pBdr/>
@@ -23607,11 +23676,11 @@
         <w:tblBorders/>
       </w:tblPr>
       <w:tcPr>
-        <w:shd w:color="ffffff"/>
+        <w:shd w:val="clear" w:color="ffffff"/>
         <w:tcBorders>
-          <w:top w:val="none"/>
-          <w:left w:val="none"/>
-          <w:bottom w:val="none"/>
+          <w:top w:val="none" w:color="000000" w:sz="4" w:space="0"/>
+          <w:left w:val="none" w:color="000000" w:sz="4" w:space="0"/>
+          <w:bottom w:val="none" w:color="000000" w:sz="4" w:space="0"/>
           <w:right w:val="single" w:color="000000" w:themeColor="accent2" w:themeTint="97" w:sz="4" w:space="0"/>
         </w:tcBorders>
       </w:tcPr>
@@ -23634,10 +23703,10 @@
       <w:tcPr>
         <w:shd w:val="clear" w:color="ffffff" w:themeColor="light1" w:fill="ffffff" w:themeFill="light1"/>
         <w:tcBorders>
-          <w:top w:val="none"/>
-          <w:left w:val="none"/>
+          <w:top w:val="none" w:color="000000" w:sz="4" w:space="0"/>
+          <w:left w:val="none" w:color="000000" w:sz="4" w:space="0"/>
           <w:bottom w:val="single" w:color="000000" w:themeColor="accent2" w:themeTint="97" w:sz="4" w:space="0"/>
-          <w:right w:val="none"/>
+          <w:right w:val="none" w:color="000000" w:sz="4" w:space="0"/>
         </w:tcBorders>
       </w:tcPr>
     </w:tblStylePr>
@@ -23657,12 +23726,12 @@
         <w:tblBorders/>
       </w:tblPr>
       <w:tcPr>
-        <w:shd w:color="ffffff"/>
+        <w:shd w:val="clear" w:color="ffffff"/>
         <w:tcBorders>
-          <w:top w:val="none"/>
+          <w:top w:val="none" w:color="000000" w:sz="4" w:space="0"/>
           <w:left w:val="single" w:color="000000" w:themeColor="accent2" w:themeTint="97" w:sz="4" w:space="0"/>
-          <w:bottom w:val="none"/>
-          <w:right w:val="none"/>
+          <w:bottom w:val="none" w:color="000000" w:sz="4" w:space="0"/>
+          <w:right w:val="none" w:color="000000" w:sz="4" w:space="0"/>
         </w:tcBorders>
       </w:tcPr>
     </w:tblStylePr>
@@ -23685,9 +23754,9 @@
         <w:shd w:val="clear" w:color="ffffff" w:themeColor="light1" w:fill="ffffff" w:themeFill="light1"/>
         <w:tcBorders>
           <w:top w:val="single" w:color="000000" w:themeColor="accent2" w:themeTint="97" w:sz="4" w:space="0"/>
-          <w:left w:val="none"/>
-          <w:bottom w:val="none"/>
-          <w:right w:val="none"/>
+          <w:left w:val="none" w:color="000000" w:sz="4" w:space="0"/>
+          <w:bottom w:val="none" w:color="000000" w:sz="4" w:space="0"/>
+          <w:right w:val="none" w:color="000000" w:sz="4" w:space="0"/>
         </w:tcBorders>
       </w:tcPr>
     </w:tblStylePr>
@@ -23762,9 +23831,9 @@
       </w:tcPr>
     </w:tblStylePr>
   </w:style>
-  <w:style w:type="table" w:styleId="113">
+  <w:style w:type="table" w:styleId="802">
     <w:name w:val="List Table 7 Colorful - Accent 3"/>
-    <w:basedOn w:val="665"/>
+    <w:basedOn w:val="887"/>
     <w:uiPriority w:val="99"/>
     <w:pPr>
       <w:pBdr/>
@@ -23863,11 +23932,11 @@
         <w:tblBorders/>
       </w:tblPr>
       <w:tcPr>
-        <w:shd w:color="ffffff"/>
+        <w:shd w:val="clear" w:color="ffffff"/>
         <w:tcBorders>
-          <w:top w:val="none"/>
-          <w:left w:val="none"/>
-          <w:bottom w:val="none"/>
+          <w:top w:val="none" w:color="000000" w:sz="4" w:space="0"/>
+          <w:left w:val="none" w:color="000000" w:sz="4" w:space="0"/>
+          <w:bottom w:val="none" w:color="000000" w:sz="4" w:space="0"/>
           <w:right w:val="single" w:color="000000" w:themeColor="accent3" w:themeTint="98" w:sz="4" w:space="0"/>
         </w:tcBorders>
       </w:tcPr>
@@ -23890,10 +23959,10 @@
       <w:tcPr>
         <w:shd w:val="clear" w:color="ffffff" w:themeColor="light1" w:fill="ffffff" w:themeFill="light1"/>
         <w:tcBorders>
-          <w:top w:val="none"/>
-          <w:left w:val="none"/>
+          <w:top w:val="none" w:color="000000" w:sz="4" w:space="0"/>
+          <w:left w:val="none" w:color="000000" w:sz="4" w:space="0"/>
           <w:bottom w:val="single" w:color="000000" w:themeColor="accent3" w:themeTint="98" w:sz="4" w:space="0"/>
-          <w:right w:val="none"/>
+          <w:right w:val="none" w:color="000000" w:sz="4" w:space="0"/>
         </w:tcBorders>
       </w:tcPr>
     </w:tblStylePr>
@@ -23913,12 +23982,12 @@
         <w:tblBorders/>
       </w:tblPr>
       <w:tcPr>
-        <w:shd w:color="ffffff"/>
+        <w:shd w:val="clear" w:color="ffffff"/>
         <w:tcBorders>
-          <w:top w:val="none"/>
+          <w:top w:val="none" w:color="000000" w:sz="4" w:space="0"/>
           <w:left w:val="single" w:color="000000" w:themeColor="accent3" w:themeTint="98" w:sz="4" w:space="0"/>
-          <w:bottom w:val="none"/>
-          <w:right w:val="none"/>
+          <w:bottom w:val="none" w:color="000000" w:sz="4" w:space="0"/>
+          <w:right w:val="none" w:color="000000" w:sz="4" w:space="0"/>
         </w:tcBorders>
       </w:tcPr>
     </w:tblStylePr>
@@ -23941,9 +24010,9 @@
         <w:shd w:val="clear" w:color="ffffff" w:themeColor="light1" w:fill="ffffff" w:themeFill="light1"/>
         <w:tcBorders>
           <w:top w:val="single" w:color="000000" w:themeColor="accent3" w:themeTint="98" w:sz="4" w:space="0"/>
-          <w:left w:val="none"/>
-          <w:bottom w:val="none"/>
-          <w:right w:val="none"/>
+          <w:left w:val="none" w:color="000000" w:sz="4" w:space="0"/>
+          <w:bottom w:val="none" w:color="000000" w:sz="4" w:space="0"/>
+          <w:right w:val="none" w:color="000000" w:sz="4" w:space="0"/>
         </w:tcBorders>
       </w:tcPr>
     </w:tblStylePr>
@@ -24018,9 +24087,9 @@
       </w:tcPr>
     </w:tblStylePr>
   </w:style>
-  <w:style w:type="table" w:styleId="114">
+  <w:style w:type="table" w:styleId="803">
     <w:name w:val="List Table 7 Colorful - Accent 4"/>
-    <w:basedOn w:val="665"/>
+    <w:basedOn w:val="887"/>
     <w:uiPriority w:val="99"/>
     <w:pPr>
       <w:pBdr/>
@@ -24119,11 +24188,11 @@
         <w:tblBorders/>
       </w:tblPr>
       <w:tcPr>
-        <w:shd w:color="ffffff"/>
+        <w:shd w:val="clear" w:color="ffffff"/>
         <w:tcBorders>
-          <w:top w:val="none"/>
-          <w:left w:val="none"/>
-          <w:bottom w:val="none"/>
+          <w:top w:val="none" w:color="000000" w:sz="4" w:space="0"/>
+          <w:left w:val="none" w:color="000000" w:sz="4" w:space="0"/>
+          <w:bottom w:val="none" w:color="000000" w:sz="4" w:space="0"/>
           <w:right w:val="single" w:color="000000" w:themeColor="accent4" w:themeTint="9A" w:sz="4" w:space="0"/>
         </w:tcBorders>
       </w:tcPr>
@@ -24146,10 +24215,10 @@
       <w:tcPr>
         <w:shd w:val="clear" w:color="ffffff" w:themeColor="light1" w:fill="ffffff" w:themeFill="light1"/>
         <w:tcBorders>
-          <w:top w:val="none"/>
-          <w:left w:val="none"/>
+          <w:top w:val="none" w:color="000000" w:sz="4" w:space="0"/>
+          <w:left w:val="none" w:color="000000" w:sz="4" w:space="0"/>
           <w:bottom w:val="single" w:color="000000" w:themeColor="accent4" w:themeTint="9A" w:sz="4" w:space="0"/>
-          <w:right w:val="none"/>
+          <w:right w:val="none" w:color="000000" w:sz="4" w:space="0"/>
         </w:tcBorders>
       </w:tcPr>
     </w:tblStylePr>
@@ -24169,12 +24238,12 @@
         <w:tblBorders/>
       </w:tblPr>
       <w:tcPr>
-        <w:shd w:color="ffffff"/>
+        <w:shd w:val="clear" w:color="ffffff"/>
         <w:tcBorders>
-          <w:top w:val="none"/>
+          <w:top w:val="none" w:color="000000" w:sz="4" w:space="0"/>
           <w:left w:val="single" w:color="000000" w:themeColor="accent4" w:themeTint="9A" w:sz="4" w:space="0"/>
-          <w:bottom w:val="none"/>
-          <w:right w:val="none"/>
+          <w:bottom w:val="none" w:color="000000" w:sz="4" w:space="0"/>
+          <w:right w:val="none" w:color="000000" w:sz="4" w:space="0"/>
         </w:tcBorders>
       </w:tcPr>
     </w:tblStylePr>
@@ -24197,9 +24266,9 @@
         <w:shd w:val="clear" w:color="ffffff" w:themeColor="light1" w:fill="ffffff" w:themeFill="light1"/>
         <w:tcBorders>
           <w:top w:val="single" w:color="000000" w:themeColor="accent4" w:themeTint="9A" w:sz="4" w:space="0"/>
-          <w:left w:val="none"/>
-          <w:bottom w:val="none"/>
-          <w:right w:val="none"/>
+          <w:left w:val="none" w:color="000000" w:sz="4" w:space="0"/>
+          <w:bottom w:val="none" w:color="000000" w:sz="4" w:space="0"/>
+          <w:right w:val="none" w:color="000000" w:sz="4" w:space="0"/>
         </w:tcBorders>
       </w:tcPr>
     </w:tblStylePr>
@@ -24274,9 +24343,9 @@
       </w:tcPr>
     </w:tblStylePr>
   </w:style>
-  <w:style w:type="table" w:styleId="115">
+  <w:style w:type="table" w:styleId="804">
     <w:name w:val="List Table 7 Colorful - Accent 5"/>
-    <w:basedOn w:val="665"/>
+    <w:basedOn w:val="887"/>
     <w:uiPriority w:val="99"/>
     <w:pPr>
       <w:pBdr/>
@@ -24375,11 +24444,11 @@
         <w:tblBorders/>
       </w:tblPr>
       <w:tcPr>
-        <w:shd w:color="ffffff"/>
+        <w:shd w:val="clear" w:color="ffffff"/>
         <w:tcBorders>
-          <w:top w:val="none"/>
-          <w:left w:val="none"/>
-          <w:bottom w:val="none"/>
+          <w:top w:val="none" w:color="000000" w:sz="4" w:space="0"/>
+          <w:left w:val="none" w:color="000000" w:sz="4" w:space="0"/>
+          <w:bottom w:val="none" w:color="000000" w:sz="4" w:space="0"/>
           <w:right w:val="single" w:color="000000" w:themeColor="accent5" w:themeTint="9A" w:sz="4" w:space="0"/>
         </w:tcBorders>
       </w:tcPr>
@@ -24402,10 +24471,10 @@
       <w:tcPr>
         <w:shd w:val="clear" w:color="ffffff" w:themeColor="light1" w:fill="ffffff" w:themeFill="light1"/>
         <w:tcBorders>
-          <w:top w:val="none"/>
-          <w:left w:val="none"/>
+          <w:top w:val="none" w:color="000000" w:sz="4" w:space="0"/>
+          <w:left w:val="none" w:color="000000" w:sz="4" w:space="0"/>
           <w:bottom w:val="single" w:color="000000" w:themeColor="accent5" w:themeTint="9A" w:sz="4" w:space="0"/>
-          <w:right w:val="none"/>
+          <w:right w:val="none" w:color="000000" w:sz="4" w:space="0"/>
         </w:tcBorders>
       </w:tcPr>
     </w:tblStylePr>
@@ -24425,12 +24494,12 @@
         <w:tblBorders/>
       </w:tblPr>
       <w:tcPr>
-        <w:shd w:color="ffffff"/>
+        <w:shd w:val="clear" w:color="ffffff"/>
         <w:tcBorders>
-          <w:top w:val="none"/>
+          <w:top w:val="none" w:color="000000" w:sz="4" w:space="0"/>
           <w:left w:val="single" w:color="000000" w:themeColor="accent5" w:themeTint="9A" w:sz="4" w:space="0"/>
-          <w:bottom w:val="none"/>
-          <w:right w:val="none"/>
+          <w:bottom w:val="none" w:color="000000" w:sz="4" w:space="0"/>
+          <w:right w:val="none" w:color="000000" w:sz="4" w:space="0"/>
         </w:tcBorders>
       </w:tcPr>
     </w:tblStylePr>
@@ -24453,9 +24522,9 @@
         <w:shd w:val="clear" w:color="ffffff" w:themeColor="light1" w:fill="ffffff" w:themeFill="light1"/>
         <w:tcBorders>
           <w:top w:val="single" w:color="000000" w:themeColor="accent5" w:themeTint="9A" w:sz="4" w:space="0"/>
-          <w:left w:val="none"/>
-          <w:bottom w:val="none"/>
-          <w:right w:val="none"/>
+          <w:left w:val="none" w:color="000000" w:sz="4" w:space="0"/>
+          <w:bottom w:val="none" w:color="000000" w:sz="4" w:space="0"/>
+          <w:right w:val="none" w:color="000000" w:sz="4" w:space="0"/>
         </w:tcBorders>
       </w:tcPr>
     </w:tblStylePr>
@@ -24530,9 +24599,9 @@
       </w:tcPr>
     </w:tblStylePr>
   </w:style>
-  <w:style w:type="table" w:styleId="116">
+  <w:style w:type="table" w:styleId="805">
     <w:name w:val="List Table 7 Colorful - Accent 6"/>
-    <w:basedOn w:val="665"/>
+    <w:basedOn w:val="887"/>
     <w:uiPriority w:val="99"/>
     <w:pPr>
       <w:pBdr/>
@@ -24631,11 +24700,11 @@
         <w:tblBorders/>
       </w:tblPr>
       <w:tcPr>
-        <w:shd w:color="ffffff"/>
+        <w:shd w:val="clear" w:color="ffffff"/>
         <w:tcBorders>
-          <w:top w:val="none"/>
-          <w:left w:val="none"/>
-          <w:bottom w:val="none"/>
+          <w:top w:val="none" w:color="000000" w:sz="4" w:space="0"/>
+          <w:left w:val="none" w:color="000000" w:sz="4" w:space="0"/>
+          <w:bottom w:val="none" w:color="000000" w:sz="4" w:space="0"/>
           <w:right w:val="single" w:color="000000" w:themeColor="accent6" w:themeTint="98" w:sz="4" w:space="0"/>
         </w:tcBorders>
       </w:tcPr>
@@ -24658,10 +24727,10 @@
       <w:tcPr>
         <w:shd w:val="clear" w:color="ffffff" w:themeColor="light1" w:fill="ffffff" w:themeFill="light1"/>
         <w:tcBorders>
-          <w:top w:val="none"/>
-          <w:left w:val="none"/>
+          <w:top w:val="none" w:color="000000" w:sz="4" w:space="0"/>
+          <w:left w:val="none" w:color="000000" w:sz="4" w:space="0"/>
           <w:bottom w:val="single" w:color="000000" w:themeColor="accent6" w:themeTint="98" w:sz="4" w:space="0"/>
-          <w:right w:val="none"/>
+          <w:right w:val="none" w:color="000000" w:sz="4" w:space="0"/>
         </w:tcBorders>
       </w:tcPr>
     </w:tblStylePr>
@@ -24681,12 +24750,12 @@
         <w:tblBorders/>
       </w:tblPr>
       <w:tcPr>
-        <w:shd w:color="ffffff"/>
+        <w:shd w:val="clear" w:color="ffffff"/>
         <w:tcBorders>
-          <w:top w:val="none"/>
+          <w:top w:val="none" w:color="000000" w:sz="4" w:space="0"/>
           <w:left w:val="single" w:color="000000" w:themeColor="accent6" w:themeTint="98" w:sz="4" w:space="0"/>
-          <w:bottom w:val="none"/>
-          <w:right w:val="none"/>
+          <w:bottom w:val="none" w:color="000000" w:sz="4" w:space="0"/>
+          <w:right w:val="none" w:color="000000" w:sz="4" w:space="0"/>
         </w:tcBorders>
       </w:tcPr>
     </w:tblStylePr>
@@ -24709,9 +24778,9 @@
         <w:shd w:val="clear" w:color="ffffff" w:themeColor="light1" w:fill="ffffff" w:themeFill="light1"/>
         <w:tcBorders>
           <w:top w:val="single" w:color="000000" w:themeColor="accent6" w:themeTint="98" w:sz="4" w:space="0"/>
-          <w:left w:val="none"/>
-          <w:bottom w:val="none"/>
-          <w:right w:val="none"/>
+          <w:left w:val="none" w:color="000000" w:sz="4" w:space="0"/>
+          <w:bottom w:val="none" w:color="000000" w:sz="4" w:space="0"/>
+          <w:right w:val="none" w:color="000000" w:sz="4" w:space="0"/>
         </w:tcBorders>
       </w:tcPr>
     </w:tblStylePr>
@@ -24786,9 +24855,9 @@
       </w:tcPr>
     </w:tblStylePr>
   </w:style>
-  <w:style w:type="table" w:styleId="117">
+  <w:style w:type="table" w:styleId="806">
     <w:name w:val="Lined - Accent"/>
-    <w:basedOn w:val="665"/>
+    <w:basedOn w:val="887"/>
     <w:uiPriority w:val="99"/>
     <w:pPr>
       <w:pBdr/>
@@ -25023,9 +25092,9 @@
       </w:tcPr>
     </w:tblStylePr>
   </w:style>
-  <w:style w:type="table" w:styleId="118">
+  <w:style w:type="table" w:styleId="807">
     <w:name w:val="Lined - Accent 1"/>
-    <w:basedOn w:val="665"/>
+    <w:basedOn w:val="887"/>
     <w:uiPriority w:val="99"/>
     <w:pPr>
       <w:pBdr/>
@@ -25260,9 +25329,9 @@
       </w:tcPr>
     </w:tblStylePr>
   </w:style>
-  <w:style w:type="table" w:styleId="119">
+  <w:style w:type="table" w:styleId="808">
     <w:name w:val="Lined - Accent 2"/>
-    <w:basedOn w:val="665"/>
+    <w:basedOn w:val="887"/>
     <w:uiPriority w:val="99"/>
     <w:pPr>
       <w:pBdr/>
@@ -25497,9 +25566,9 @@
       </w:tcPr>
     </w:tblStylePr>
   </w:style>
-  <w:style w:type="table" w:styleId="120">
+  <w:style w:type="table" w:styleId="809">
     <w:name w:val="Lined - Accent 3"/>
-    <w:basedOn w:val="665"/>
+    <w:basedOn w:val="887"/>
     <w:uiPriority w:val="99"/>
     <w:pPr>
       <w:pBdr/>
@@ -25734,9 +25803,9 @@
       </w:tcPr>
     </w:tblStylePr>
   </w:style>
-  <w:style w:type="table" w:styleId="121">
+  <w:style w:type="table" w:styleId="810">
     <w:name w:val="Lined - Accent 4"/>
-    <w:basedOn w:val="665"/>
+    <w:basedOn w:val="887"/>
     <w:uiPriority w:val="99"/>
     <w:pPr>
       <w:pBdr/>
@@ -25971,9 +26040,9 @@
       </w:tcPr>
     </w:tblStylePr>
   </w:style>
-  <w:style w:type="table" w:styleId="122">
+  <w:style w:type="table" w:styleId="811">
     <w:name w:val="Lined - Accent 5"/>
-    <w:basedOn w:val="665"/>
+    <w:basedOn w:val="887"/>
     <w:uiPriority w:val="99"/>
     <w:pPr>
       <w:pBdr/>
@@ -26208,9 +26277,9 @@
       </w:tcPr>
     </w:tblStylePr>
   </w:style>
-  <w:style w:type="table" w:styleId="123">
+  <w:style w:type="table" w:styleId="812">
     <w:name w:val="Lined - Accent 6"/>
-    <w:basedOn w:val="665"/>
+    <w:basedOn w:val="887"/>
     <w:uiPriority w:val="99"/>
     <w:pPr>
       <w:pBdr/>
@@ -26445,9 +26514,9 @@
       </w:tcPr>
     </w:tblStylePr>
   </w:style>
-  <w:style w:type="table" w:styleId="124">
+  <w:style w:type="table" w:styleId="813">
     <w:name w:val="Bordered &amp; Lined - Accent"/>
-    <w:basedOn w:val="665"/>
+    <w:basedOn w:val="887"/>
     <w:uiPriority w:val="99"/>
     <w:pPr>
       <w:pBdr/>
@@ -26689,9 +26758,9 @@
       </w:tcPr>
     </w:tblStylePr>
   </w:style>
-  <w:style w:type="table" w:styleId="125">
+  <w:style w:type="table" w:styleId="814">
     <w:name w:val="Bordered &amp; Lined - Accent 1"/>
-    <w:basedOn w:val="665"/>
+    <w:basedOn w:val="887"/>
     <w:uiPriority w:val="99"/>
     <w:pPr>
       <w:pBdr/>
@@ -26933,9 +27002,9 @@
       </w:tcPr>
     </w:tblStylePr>
   </w:style>
-  <w:style w:type="table" w:styleId="126">
+  <w:style w:type="table" w:styleId="815">
     <w:name w:val="Bordered &amp; Lined - Accent 2"/>
-    <w:basedOn w:val="665"/>
+    <w:basedOn w:val="887"/>
     <w:uiPriority w:val="99"/>
     <w:pPr>
       <w:pBdr/>
@@ -27177,9 +27246,9 @@
       </w:tcPr>
     </w:tblStylePr>
   </w:style>
-  <w:style w:type="table" w:styleId="127">
+  <w:style w:type="table" w:styleId="816">
     <w:name w:val="Bordered &amp; Lined - Accent 3"/>
-    <w:basedOn w:val="665"/>
+    <w:basedOn w:val="887"/>
     <w:uiPriority w:val="99"/>
     <w:pPr>
       <w:pBdr/>
@@ -27421,9 +27490,9 @@
       </w:tcPr>
     </w:tblStylePr>
   </w:style>
-  <w:style w:type="table" w:styleId="128">
+  <w:style w:type="table" w:styleId="817">
     <w:name w:val="Bordered &amp; Lined - Accent 4"/>
-    <w:basedOn w:val="665"/>
+    <w:basedOn w:val="887"/>
     <w:uiPriority w:val="99"/>
     <w:pPr>
       <w:pBdr/>
@@ -27665,9 +27734,9 @@
       </w:tcPr>
     </w:tblStylePr>
   </w:style>
-  <w:style w:type="table" w:styleId="129">
+  <w:style w:type="table" w:styleId="818">
     <w:name w:val="Bordered &amp; Lined - Accent 5"/>
-    <w:basedOn w:val="665"/>
+    <w:basedOn w:val="887"/>
     <w:uiPriority w:val="99"/>
     <w:pPr>
       <w:pBdr/>
@@ -27909,9 +27978,9 @@
       </w:tcPr>
     </w:tblStylePr>
   </w:style>
-  <w:style w:type="table" w:styleId="130">
+  <w:style w:type="table" w:styleId="819">
     <w:name w:val="Bordered &amp; Lined - Accent 6"/>
-    <w:basedOn w:val="665"/>
+    <w:basedOn w:val="887"/>
     <w:uiPriority w:val="99"/>
     <w:pPr>
       <w:pBdr/>
@@ -28153,9 +28222,9 @@
       </w:tcPr>
     </w:tblStylePr>
   </w:style>
-  <w:style w:type="table" w:styleId="131">
+  <w:style w:type="table" w:styleId="820">
     <w:name w:val="Bordered"/>
-    <w:basedOn w:val="665"/>
+    <w:basedOn w:val="887"/>
     <w:uiPriority w:val="99"/>
     <w:pPr>
       <w:pBdr/>
@@ -28384,9 +28453,9 @@
       </w:tcPr>
     </w:tblStylePr>
   </w:style>
-  <w:style w:type="table" w:styleId="132">
+  <w:style w:type="table" w:styleId="821">
     <w:name w:val="Bordered - Accent 1"/>
-    <w:basedOn w:val="665"/>
+    <w:basedOn w:val="887"/>
     <w:uiPriority w:val="99"/>
     <w:pPr>
       <w:pBdr/>
@@ -28615,9 +28684,9 @@
       </w:tcPr>
     </w:tblStylePr>
   </w:style>
-  <w:style w:type="table" w:styleId="133">
+  <w:style w:type="table" w:styleId="822">
     <w:name w:val="Bordered - Accent 2"/>
-    <w:basedOn w:val="665"/>
+    <w:basedOn w:val="887"/>
     <w:uiPriority w:val="99"/>
     <w:pPr>
       <w:pBdr/>
@@ -28846,9 +28915,9 @@
       </w:tcPr>
     </w:tblStylePr>
   </w:style>
-  <w:style w:type="table" w:styleId="134">
+  <w:style w:type="table" w:styleId="823">
     <w:name w:val="Bordered - Accent 3"/>
-    <w:basedOn w:val="665"/>
+    <w:basedOn w:val="887"/>
     <w:uiPriority w:val="99"/>
     <w:pPr>
       <w:pBdr/>
@@ -29077,9 +29146,9 @@
       </w:tcPr>
     </w:tblStylePr>
   </w:style>
-  <w:style w:type="table" w:styleId="135">
+  <w:style w:type="table" w:styleId="824">
     <w:name w:val="Bordered - Accent 4"/>
-    <w:basedOn w:val="665"/>
+    <w:basedOn w:val="887"/>
     <w:uiPriority w:val="99"/>
     <w:pPr>
       <w:pBdr/>
@@ -29308,9 +29377,9 @@
       </w:tcPr>
     </w:tblStylePr>
   </w:style>
-  <w:style w:type="table" w:styleId="136">
+  <w:style w:type="table" w:styleId="825">
     <w:name w:val="Bordered - Accent 5"/>
-    <w:basedOn w:val="665"/>
+    <w:basedOn w:val="887"/>
     <w:uiPriority w:val="99"/>
     <w:pPr>
       <w:pBdr/>
@@ -29539,9 +29608,9 @@
       </w:tcPr>
     </w:tblStylePr>
   </w:style>
-  <w:style w:type="table" w:styleId="137">
+  <w:style w:type="table" w:styleId="826">
     <w:name w:val="Bordered - Accent 6"/>
-    <w:basedOn w:val="665"/>
+    <w:basedOn w:val="887"/>
     <w:uiPriority w:val="99"/>
     <w:pPr>
       <w:pBdr/>
@@ -29770,11 +29839,11 @@
       </w:tcPr>
     </w:tblStylePr>
   </w:style>
-  <w:style w:type="paragraph" w:styleId="139">
+  <w:style w:type="paragraph" w:styleId="827">
     <w:name w:val="Heading 1"/>
-    <w:basedOn w:val="664"/>
-    <w:next w:val="664"/>
-    <w:link w:val="150"/>
+    <w:basedOn w:val="886"/>
+    <w:next w:val="886"/>
+    <w:link w:val="837"/>
     <w:uiPriority w:val="9"/>
     <w:qFormat/>
     <w:pPr>
@@ -29792,11 +29861,11 @@
       <w:szCs w:val="40"/>
     </w:rPr>
   </w:style>
-  <w:style w:type="paragraph" w:styleId="140">
+  <w:style w:type="paragraph" w:styleId="828">
     <w:name w:val="Heading 2"/>
-    <w:basedOn w:val="664"/>
-    <w:next w:val="664"/>
-    <w:link w:val="151"/>
+    <w:basedOn w:val="886"/>
+    <w:next w:val="886"/>
+    <w:link w:val="838"/>
     <w:uiPriority w:val="9"/>
     <w:unhideWhenUsed/>
     <w:qFormat/>
@@ -29815,11 +29884,11 @@
       <w:szCs w:val="32"/>
     </w:rPr>
   </w:style>
-  <w:style w:type="paragraph" w:styleId="141">
+  <w:style w:type="paragraph" w:styleId="829">
     <w:name w:val="Heading 3"/>
-    <w:basedOn w:val="664"/>
-    <w:next w:val="664"/>
-    <w:link w:val="152"/>
+    <w:basedOn w:val="886"/>
+    <w:next w:val="886"/>
+    <w:link w:val="839"/>
     <w:uiPriority w:val="9"/>
     <w:unhideWhenUsed/>
     <w:qFormat/>
@@ -29838,11 +29907,11 @@
       <w:szCs w:val="28"/>
     </w:rPr>
   </w:style>
-  <w:style w:type="paragraph" w:styleId="142">
+  <w:style w:type="paragraph" w:styleId="830">
     <w:name w:val="Heading 4"/>
-    <w:basedOn w:val="664"/>
-    <w:next w:val="664"/>
-    <w:link w:val="153"/>
+    <w:basedOn w:val="886"/>
+    <w:next w:val="886"/>
+    <w:link w:val="840"/>
     <w:uiPriority w:val="9"/>
     <w:unhideWhenUsed/>
     <w:qFormat/>
@@ -29861,11 +29930,11 @@
       <w:color w:val="0f4761" w:themeColor="accent1" w:themeShade="BF"/>
     </w:rPr>
   </w:style>
-  <w:style w:type="paragraph" w:styleId="143">
+  <w:style w:type="paragraph" w:styleId="831">
     <w:name w:val="Heading 5"/>
-    <w:basedOn w:val="664"/>
-    <w:next w:val="664"/>
-    <w:link w:val="154"/>
+    <w:basedOn w:val="886"/>
+    <w:next w:val="886"/>
+    <w:link w:val="841"/>
     <w:uiPriority w:val="9"/>
     <w:unhideWhenUsed/>
     <w:qFormat/>
@@ -29882,11 +29951,11 @@
       <w:color w:val="0f4761" w:themeColor="accent1" w:themeShade="BF"/>
     </w:rPr>
   </w:style>
-  <w:style w:type="paragraph" w:styleId="144">
+  <w:style w:type="paragraph" w:styleId="832">
     <w:name w:val="Heading 6"/>
-    <w:basedOn w:val="664"/>
-    <w:next w:val="664"/>
-    <w:link w:val="155"/>
+    <w:basedOn w:val="886"/>
+    <w:next w:val="886"/>
+    <w:link w:val="842"/>
     <w:uiPriority w:val="9"/>
     <w:unhideWhenUsed/>
     <w:qFormat/>
@@ -29905,11 +29974,11 @@
       <w:color w:val="595959" w:themeColor="text1" w:themeTint="A6"/>
     </w:rPr>
   </w:style>
-  <w:style w:type="paragraph" w:styleId="145">
+  <w:style w:type="paragraph" w:styleId="833">
     <w:name w:val="Heading 7"/>
-    <w:basedOn w:val="664"/>
-    <w:next w:val="664"/>
-    <w:link w:val="156"/>
+    <w:basedOn w:val="886"/>
+    <w:next w:val="886"/>
+    <w:link w:val="843"/>
     <w:uiPriority w:val="9"/>
     <w:unhideWhenUsed/>
     <w:qFormat/>
@@ -29926,11 +29995,11 @@
       <w:color w:val="595959" w:themeColor="text1" w:themeTint="A6"/>
     </w:rPr>
   </w:style>
-  <w:style w:type="paragraph" w:styleId="146">
+  <w:style w:type="paragraph" w:styleId="834">
     <w:name w:val="Heading 8"/>
-    <w:basedOn w:val="664"/>
-    <w:next w:val="664"/>
-    <w:link w:val="157"/>
+    <w:basedOn w:val="886"/>
+    <w:next w:val="886"/>
+    <w:link w:val="844"/>
     <w:uiPriority w:val="9"/>
     <w:unhideWhenUsed/>
     <w:qFormat/>
@@ -29949,11 +30018,11 @@
       <w:color w:val="272727" w:themeColor="text1" w:themeTint="D8"/>
     </w:rPr>
   </w:style>
-  <w:style w:type="paragraph" w:styleId="147">
+  <w:style w:type="paragraph" w:styleId="835">
     <w:name w:val="Heading 9"/>
-    <w:basedOn w:val="664"/>
-    <w:next w:val="664"/>
-    <w:link w:val="158"/>
+    <w:basedOn w:val="886"/>
+    <w:next w:val="886"/>
+    <w:link w:val="845"/>
     <w:uiPriority w:val="9"/>
     <w:unhideWhenUsed/>
     <w:qFormat/>
@@ -29972,7 +30041,7 @@
       <w:color w:val="272727" w:themeColor="text1" w:themeTint="D8"/>
     </w:rPr>
   </w:style>
-  <w:style w:type="character" w:styleId="148" w:default="1">
+  <w:style w:type="character" w:styleId="836" w:default="1">
     <w:name w:val="Default Paragraph Font"/>
     <w:uiPriority w:val="1"/>
     <w:semiHidden/>
@@ -29983,10 +30052,10 @@
       <w:ind/>
     </w:pPr>
   </w:style>
-  <w:style w:type="character" w:styleId="150">
+  <w:style w:type="character" w:styleId="837">
     <w:name w:val="Heading 1 Char"/>
-    <w:basedOn w:val="148"/>
-    <w:link w:val="139"/>
+    <w:basedOn w:val="836"/>
+    <w:link w:val="827"/>
     <w:uiPriority w:val="9"/>
     <w:pPr>
       <w:pBdr/>
@@ -30000,10 +30069,10 @@
       <w:szCs w:val="40"/>
     </w:rPr>
   </w:style>
-  <w:style w:type="character" w:styleId="151">
+  <w:style w:type="character" w:styleId="838">
     <w:name w:val="Heading 2 Char"/>
-    <w:basedOn w:val="148"/>
-    <w:link w:val="140"/>
+    <w:basedOn w:val="836"/>
+    <w:link w:val="828"/>
     <w:uiPriority w:val="9"/>
     <w:pPr>
       <w:pBdr/>
@@ -30017,10 +30086,10 @@
       <w:szCs w:val="32"/>
     </w:rPr>
   </w:style>
-  <w:style w:type="character" w:styleId="152">
+  <w:style w:type="character" w:styleId="839">
     <w:name w:val="Heading 3 Char"/>
-    <w:basedOn w:val="148"/>
-    <w:link w:val="141"/>
+    <w:basedOn w:val="836"/>
+    <w:link w:val="829"/>
     <w:uiPriority w:val="9"/>
     <w:pPr>
       <w:pBdr/>
@@ -30034,10 +30103,10 @@
       <w:szCs w:val="28"/>
     </w:rPr>
   </w:style>
-  <w:style w:type="character" w:styleId="153">
+  <w:style w:type="character" w:styleId="840">
     <w:name w:val="Heading 4 Char"/>
-    <w:basedOn w:val="148"/>
-    <w:link w:val="142"/>
+    <w:basedOn w:val="836"/>
+    <w:link w:val="830"/>
     <w:uiPriority w:val="9"/>
     <w:pPr>
       <w:pBdr/>
@@ -30051,10 +30120,10 @@
       <w:color w:val="0f4761" w:themeColor="accent1" w:themeShade="BF"/>
     </w:rPr>
   </w:style>
-  <w:style w:type="character" w:styleId="154">
+  <w:style w:type="character" w:styleId="841">
     <w:name w:val="Heading 5 Char"/>
-    <w:basedOn w:val="148"/>
-    <w:link w:val="143"/>
+    <w:basedOn w:val="836"/>
+    <w:link w:val="831"/>
     <w:uiPriority w:val="9"/>
     <w:pPr>
       <w:pBdr/>
@@ -30066,10 +30135,10 @@
       <w:color w:val="0f4761" w:themeColor="accent1" w:themeShade="BF"/>
     </w:rPr>
   </w:style>
-  <w:style w:type="character" w:styleId="155">
+  <w:style w:type="character" w:styleId="842">
     <w:name w:val="Heading 6 Char"/>
-    <w:basedOn w:val="148"/>
-    <w:link w:val="144"/>
+    <w:basedOn w:val="836"/>
+    <w:link w:val="832"/>
     <w:uiPriority w:val="9"/>
     <w:pPr>
       <w:pBdr/>
@@ -30083,10 +30152,10 @@
       <w:color w:val="595959" w:themeColor="text1" w:themeTint="A6"/>
     </w:rPr>
   </w:style>
-  <w:style w:type="character" w:styleId="156">
+  <w:style w:type="character" w:styleId="843">
     <w:name w:val="Heading 7 Char"/>
-    <w:basedOn w:val="148"/>
-    <w:link w:val="145"/>
+    <w:basedOn w:val="836"/>
+    <w:link w:val="833"/>
     <w:uiPriority w:val="9"/>
     <w:pPr>
       <w:pBdr/>
@@ -30098,10 +30167,10 @@
       <w:color w:val="595959" w:themeColor="text1" w:themeTint="A6"/>
     </w:rPr>
   </w:style>
-  <w:style w:type="character" w:styleId="157">
+  <w:style w:type="character" w:styleId="844">
     <w:name w:val="Heading 8 Char"/>
-    <w:basedOn w:val="148"/>
-    <w:link w:val="146"/>
+    <w:basedOn w:val="836"/>
+    <w:link w:val="834"/>
     <w:uiPriority w:val="9"/>
     <w:pPr>
       <w:pBdr/>
@@ -30115,10 +30184,10 @@
       <w:color w:val="272727" w:themeColor="text1" w:themeTint="D8"/>
     </w:rPr>
   </w:style>
-  <w:style w:type="character" w:styleId="158">
+  <w:style w:type="character" w:styleId="845">
     <w:name w:val="Heading 9 Char"/>
-    <w:basedOn w:val="148"/>
-    <w:link w:val="147"/>
+    <w:basedOn w:val="836"/>
+    <w:link w:val="835"/>
     <w:uiPriority w:val="9"/>
     <w:pPr>
       <w:pBdr/>
@@ -30132,11 +30201,11 @@
       <w:color w:val="272727" w:themeColor="text1" w:themeTint="D8"/>
     </w:rPr>
   </w:style>
-  <w:style w:type="paragraph" w:styleId="159">
+  <w:style w:type="paragraph" w:styleId="846">
     <w:name w:val="Title"/>
-    <w:basedOn w:val="664"/>
-    <w:next w:val="664"/>
-    <w:link w:val="160"/>
+    <w:basedOn w:val="886"/>
+    <w:next w:val="886"/>
+    <w:link w:val="847"/>
     <w:uiPriority w:val="10"/>
     <w:qFormat/>
     <w:pPr>
@@ -30152,10 +30221,10 @@
       <w:szCs w:val="56"/>
     </w:rPr>
   </w:style>
-  <w:style w:type="character" w:styleId="160">
+  <w:style w:type="character" w:styleId="847">
     <w:name w:val="Title Char"/>
-    <w:basedOn w:val="148"/>
-    <w:link w:val="159"/>
+    <w:basedOn w:val="836"/>
+    <w:link w:val="846"/>
     <w:uiPriority w:val="10"/>
     <w:pPr>
       <w:pBdr/>
@@ -30169,11 +30238,11 @@
       <w:szCs w:val="56"/>
     </w:rPr>
   </w:style>
-  <w:style w:type="paragraph" w:styleId="161">
+  <w:style w:type="paragraph" w:styleId="848">
     <w:name w:val="Subtitle"/>
-    <w:basedOn w:val="664"/>
-    <w:next w:val="664"/>
-    <w:link w:val="162"/>
+    <w:basedOn w:val="886"/>
+    <w:next w:val="886"/>
+    <w:link w:val="849"/>
     <w:uiPriority w:val="11"/>
     <w:qFormat/>
     <w:pPr>
@@ -30191,10 +30260,10 @@
       <w:szCs w:val="28"/>
     </w:rPr>
   </w:style>
-  <w:style w:type="character" w:styleId="162">
+  <w:style w:type="character" w:styleId="849">
     <w:name w:val="Subtitle Char"/>
-    <w:basedOn w:val="148"/>
-    <w:link w:val="161"/>
+    <w:basedOn w:val="836"/>
+    <w:link w:val="848"/>
     <w:uiPriority w:val="11"/>
     <w:pPr>
       <w:pBdr/>
@@ -30208,11 +30277,11 @@
       <w:szCs w:val="28"/>
     </w:rPr>
   </w:style>
-  <w:style w:type="paragraph" w:styleId="163">
+  <w:style w:type="paragraph" w:styleId="850">
     <w:name w:val="Quote"/>
-    <w:basedOn w:val="664"/>
-    <w:next w:val="664"/>
-    <w:link w:val="164"/>
+    <w:basedOn w:val="886"/>
+    <w:next w:val="886"/>
+    <w:link w:val="851"/>
     <w:uiPriority w:val="29"/>
     <w:qFormat/>
     <w:pPr>
@@ -30227,10 +30296,10 @@
       <w:color w:val="404040" w:themeColor="text1" w:themeTint="BF"/>
     </w:rPr>
   </w:style>
-  <w:style w:type="character" w:styleId="164">
+  <w:style w:type="character" w:styleId="851">
     <w:name w:val="Quote Char"/>
-    <w:basedOn w:val="148"/>
-    <w:link w:val="163"/>
+    <w:basedOn w:val="836"/>
+    <w:link w:val="850"/>
     <w:uiPriority w:val="29"/>
     <w:pPr>
       <w:pBdr/>
@@ -30243,9 +30312,9 @@
       <w:color w:val="404040" w:themeColor="text1" w:themeTint="BF"/>
     </w:rPr>
   </w:style>
-  <w:style w:type="character" w:styleId="166">
+  <w:style w:type="character" w:styleId="852">
     <w:name w:val="Intense Emphasis"/>
-    <w:basedOn w:val="148"/>
+    <w:basedOn w:val="836"/>
     <w:uiPriority w:val="21"/>
     <w:qFormat/>
     <w:pPr>
@@ -30259,11 +30328,11 @@
       <w:color w:val="0f4761" w:themeColor="accent1" w:themeShade="BF"/>
     </w:rPr>
   </w:style>
-  <w:style w:type="paragraph" w:styleId="167">
+  <w:style w:type="paragraph" w:styleId="853">
     <w:name w:val="Intense Quote"/>
-    <w:basedOn w:val="664"/>
-    <w:next w:val="664"/>
-    <w:link w:val="168"/>
+    <w:basedOn w:val="886"/>
+    <w:next w:val="886"/>
+    <w:link w:val="854"/>
     <w:uiPriority w:val="30"/>
     <w:qFormat/>
     <w:pPr>
@@ -30281,10 +30350,10 @@
       <w:color w:val="0f4761" w:themeColor="accent1" w:themeShade="BF"/>
     </w:rPr>
   </w:style>
-  <w:style w:type="character" w:styleId="168">
+  <w:style w:type="character" w:styleId="854">
     <w:name w:val="Intense Quote Char"/>
-    <w:basedOn w:val="148"/>
-    <w:link w:val="167"/>
+    <w:basedOn w:val="836"/>
+    <w:link w:val="853"/>
     <w:uiPriority w:val="30"/>
     <w:pPr>
       <w:pBdr/>
@@ -30297,9 +30366,9 @@
       <w:color w:val="0f4761" w:themeColor="accent1" w:themeShade="BF"/>
     </w:rPr>
   </w:style>
-  <w:style w:type="character" w:styleId="169">
+  <w:style w:type="character" w:styleId="855">
     <w:name w:val="Intense Reference"/>
-    <w:basedOn w:val="148"/>
+    <w:basedOn w:val="836"/>
     <w:uiPriority w:val="32"/>
     <w:qFormat/>
     <w:pPr>
@@ -30315,9 +30384,9 @@
       <w:spacing w:val="5"/>
     </w:rPr>
   </w:style>
-  <w:style w:type="character" w:styleId="171">
+  <w:style w:type="character" w:styleId="856">
     <w:name w:val="Subtle Emphasis"/>
-    <w:basedOn w:val="148"/>
+    <w:basedOn w:val="836"/>
     <w:uiPriority w:val="19"/>
     <w:qFormat/>
     <w:pPr>
@@ -30331,9 +30400,9 @@
       <w:color w:val="404040" w:themeColor="text1" w:themeTint="BF"/>
     </w:rPr>
   </w:style>
-  <w:style w:type="character" w:styleId="172">
+  <w:style w:type="character" w:styleId="857">
     <w:name w:val="Emphasis"/>
-    <w:basedOn w:val="148"/>
+    <w:basedOn w:val="836"/>
     <w:uiPriority w:val="20"/>
     <w:qFormat/>
     <w:pPr>
@@ -30346,9 +30415,9 @@
       <w:iCs/>
     </w:rPr>
   </w:style>
-  <w:style w:type="character" w:styleId="173">
+  <w:style w:type="character" w:styleId="858">
     <w:name w:val="Strong"/>
-    <w:basedOn w:val="148"/>
+    <w:basedOn w:val="836"/>
     <w:uiPriority w:val="22"/>
     <w:qFormat/>
     <w:pPr>
@@ -30361,9 +30430,9 @@
       <w:bCs/>
     </w:rPr>
   </w:style>
-  <w:style w:type="character" w:styleId="174">
+  <w:style w:type="character" w:styleId="859">
     <w:name w:val="Subtle Reference"/>
-    <w:basedOn w:val="148"/>
+    <w:basedOn w:val="836"/>
     <w:uiPriority w:val="31"/>
     <w:qFormat/>
     <w:pPr>
@@ -30376,9 +30445,9 @@
       <w:color w:val="5a5a5a" w:themeColor="text1" w:themeTint="A5"/>
     </w:rPr>
   </w:style>
-  <w:style w:type="character" w:styleId="175">
+  <w:style w:type="character" w:styleId="860">
     <w:name w:val="Book Title"/>
-    <w:basedOn w:val="148"/>
+    <w:basedOn w:val="836"/>
     <w:uiPriority w:val="33"/>
     <w:qFormat/>
     <w:pPr>
@@ -30394,10 +30463,10 @@
       <w:spacing w:val="5"/>
     </w:rPr>
   </w:style>
-  <w:style w:type="paragraph" w:styleId="176">
+  <w:style w:type="paragraph" w:styleId="861">
     <w:name w:val="Header"/>
-    <w:basedOn w:val="664"/>
-    <w:link w:val="177"/>
+    <w:basedOn w:val="886"/>
+    <w:link w:val="862"/>
     <w:uiPriority w:val="99"/>
     <w:unhideWhenUsed/>
     <w:pPr>
@@ -30410,10 +30479,10 @@
       <w:ind/>
     </w:pPr>
   </w:style>
-  <w:style w:type="character" w:styleId="177">
+  <w:style w:type="character" w:styleId="862">
     <w:name w:val="Header Char"/>
-    <w:basedOn w:val="148"/>
-    <w:link w:val="176"/>
+    <w:basedOn w:val="836"/>
+    <w:link w:val="861"/>
     <w:uiPriority w:val="99"/>
     <w:pPr>
       <w:pBdr/>
@@ -30421,10 +30490,10 @@
       <w:ind/>
     </w:pPr>
   </w:style>
-  <w:style w:type="paragraph" w:styleId="178">
+  <w:style w:type="paragraph" w:styleId="863">
     <w:name w:val="Footer"/>
-    <w:basedOn w:val="664"/>
-    <w:link w:val="179"/>
+    <w:basedOn w:val="886"/>
+    <w:link w:val="864"/>
     <w:uiPriority w:val="99"/>
     <w:unhideWhenUsed/>
     <w:pPr>
@@ -30437,10 +30506,10 @@
       <w:ind/>
     </w:pPr>
   </w:style>
-  <w:style w:type="character" w:styleId="179">
+  <w:style w:type="character" w:styleId="864">
     <w:name w:val="Footer Char"/>
-    <w:basedOn w:val="148"/>
-    <w:link w:val="178"/>
+    <w:basedOn w:val="836"/>
+    <w:link w:val="863"/>
     <w:uiPriority w:val="99"/>
     <w:pPr>
       <w:pBdr/>
@@ -30448,10 +30517,10 @@
       <w:ind/>
     </w:pPr>
   </w:style>
-  <w:style w:type="paragraph" w:styleId="180">
+  <w:style w:type="paragraph" w:styleId="865">
     <w:name w:val="Caption"/>
-    <w:basedOn w:val="664"/>
-    <w:next w:val="664"/>
+    <w:basedOn w:val="886"/>
+    <w:next w:val="886"/>
     <w:uiPriority w:val="35"/>
     <w:unhideWhenUsed/>
     <w:qFormat/>
@@ -30468,10 +30537,10 @@
       <w:szCs w:val="18"/>
     </w:rPr>
   </w:style>
-  <w:style w:type="paragraph" w:styleId="181">
+  <w:style w:type="paragraph" w:styleId="866">
     <w:name w:val="footnote text"/>
-    <w:basedOn w:val="664"/>
-    <w:link w:val="182"/>
+    <w:basedOn w:val="886"/>
+    <w:link w:val="867"/>
     <w:uiPriority w:val="99"/>
     <w:semiHidden/>
     <w:unhideWhenUsed/>
@@ -30485,10 +30554,10 @@
       <w:szCs w:val="20"/>
     </w:rPr>
   </w:style>
-  <w:style w:type="character" w:styleId="182">
+  <w:style w:type="character" w:styleId="867">
     <w:name w:val="Footnote Text Char"/>
-    <w:basedOn w:val="148"/>
-    <w:link w:val="181"/>
+    <w:basedOn w:val="836"/>
+    <w:link w:val="866"/>
     <w:uiPriority w:val="99"/>
     <w:semiHidden/>
     <w:pPr>
@@ -30501,9 +30570,9 @@
       <w:szCs w:val="20"/>
     </w:rPr>
   </w:style>
-  <w:style w:type="character" w:styleId="183">
+  <w:style w:type="character" w:styleId="868">
     <w:name w:val="footnote reference"/>
-    <w:basedOn w:val="148"/>
+    <w:basedOn w:val="836"/>
     <w:uiPriority w:val="99"/>
     <w:semiHidden/>
     <w:unhideWhenUsed/>
@@ -30516,10 +30585,10 @@
       <w:vertAlign w:val="superscript"/>
     </w:rPr>
   </w:style>
-  <w:style w:type="paragraph" w:styleId="184">
+  <w:style w:type="paragraph" w:styleId="869">
     <w:name w:val="endnote text"/>
-    <w:basedOn w:val="664"/>
-    <w:link w:val="185"/>
+    <w:basedOn w:val="886"/>
+    <w:link w:val="870"/>
     <w:uiPriority w:val="99"/>
     <w:semiHidden/>
     <w:unhideWhenUsed/>
@@ -30533,10 +30602,10 @@
       <w:szCs w:val="20"/>
     </w:rPr>
   </w:style>
-  <w:style w:type="character" w:styleId="185">
+  <w:style w:type="character" w:styleId="870">
     <w:name w:val="Endnote Text Char"/>
-    <w:basedOn w:val="148"/>
-    <w:link w:val="184"/>
+    <w:basedOn w:val="836"/>
+    <w:link w:val="869"/>
     <w:uiPriority w:val="99"/>
     <w:semiHidden/>
     <w:pPr>
@@ -30549,9 +30618,9 @@
       <w:szCs w:val="20"/>
     </w:rPr>
   </w:style>
-  <w:style w:type="character" w:styleId="186">
+  <w:style w:type="character" w:styleId="871">
     <w:name w:val="endnote reference"/>
-    <w:basedOn w:val="148"/>
+    <w:basedOn w:val="836"/>
     <w:uiPriority w:val="99"/>
     <w:semiHidden/>
     <w:unhideWhenUsed/>
@@ -30564,9 +30633,9 @@
       <w:vertAlign w:val="superscript"/>
     </w:rPr>
   </w:style>
-  <w:style w:type="character" w:styleId="187">
+  <w:style w:type="character" w:styleId="872">
     <w:name w:val="Hyperlink"/>
-    <w:basedOn w:val="148"/>
+    <w:basedOn w:val="836"/>
     <w:uiPriority w:val="99"/>
     <w:unhideWhenUsed/>
     <w:pPr>
@@ -30579,9 +30648,9 @@
       <w:u w:val="single"/>
     </w:rPr>
   </w:style>
-  <w:style w:type="character" w:styleId="188">
+  <w:style w:type="character" w:styleId="873">
     <w:name w:val="FollowedHyperlink"/>
-    <w:basedOn w:val="148"/>
+    <w:basedOn w:val="836"/>
     <w:uiPriority w:val="99"/>
     <w:semiHidden/>
     <w:unhideWhenUsed/>
@@ -30595,10 +30664,10 @@
       <w:u w:val="single"/>
     </w:rPr>
   </w:style>
-  <w:style w:type="paragraph" w:styleId="189">
+  <w:style w:type="paragraph" w:styleId="874">
     <w:name w:val="toc 1"/>
-    <w:basedOn w:val="664"/>
-    <w:next w:val="664"/>
+    <w:basedOn w:val="886"/>
+    <w:next w:val="886"/>
     <w:uiPriority w:val="39"/>
     <w:unhideWhenUsed/>
     <w:pPr>
@@ -30607,10 +30676,10 @@
       <w:ind/>
     </w:pPr>
   </w:style>
-  <w:style w:type="paragraph" w:styleId="190">
+  <w:style w:type="paragraph" w:styleId="875">
     <w:name w:val="toc 2"/>
-    <w:basedOn w:val="664"/>
-    <w:next w:val="664"/>
+    <w:basedOn w:val="886"/>
+    <w:next w:val="886"/>
     <w:uiPriority w:val="39"/>
     <w:unhideWhenUsed/>
     <w:pPr>
@@ -30619,10 +30688,10 @@
       <w:ind w:left="220"/>
     </w:pPr>
   </w:style>
-  <w:style w:type="paragraph" w:styleId="191">
+  <w:style w:type="paragraph" w:styleId="876">
     <w:name w:val="toc 3"/>
-    <w:basedOn w:val="664"/>
-    <w:next w:val="664"/>
+    <w:basedOn w:val="886"/>
+    <w:next w:val="886"/>
     <w:uiPriority w:val="39"/>
     <w:unhideWhenUsed/>
     <w:pPr>
@@ -30631,10 +30700,10 @@
       <w:ind w:left="440"/>
     </w:pPr>
   </w:style>
-  <w:style w:type="paragraph" w:styleId="192">
+  <w:style w:type="paragraph" w:styleId="877">
     <w:name w:val="toc 4"/>
-    <w:basedOn w:val="664"/>
-    <w:next w:val="664"/>
+    <w:basedOn w:val="886"/>
+    <w:next w:val="886"/>
     <w:uiPriority w:val="39"/>
     <w:unhideWhenUsed/>
     <w:pPr>
@@ -30643,10 +30712,10 @@
       <w:ind w:left="660"/>
     </w:pPr>
   </w:style>
-  <w:style w:type="paragraph" w:styleId="193">
+  <w:style w:type="paragraph" w:styleId="878">
     <w:name w:val="toc 5"/>
-    <w:basedOn w:val="664"/>
-    <w:next w:val="664"/>
+    <w:basedOn w:val="886"/>
+    <w:next w:val="886"/>
     <w:uiPriority w:val="39"/>
     <w:unhideWhenUsed/>
     <w:pPr>
@@ -30655,10 +30724,10 @@
       <w:ind w:left="880"/>
     </w:pPr>
   </w:style>
-  <w:style w:type="paragraph" w:styleId="194">
+  <w:style w:type="paragraph" w:styleId="879">
     <w:name w:val="toc 6"/>
-    <w:basedOn w:val="664"/>
-    <w:next w:val="664"/>
+    <w:basedOn w:val="886"/>
+    <w:next w:val="886"/>
     <w:uiPriority w:val="39"/>
     <w:unhideWhenUsed/>
     <w:pPr>
@@ -30667,10 +30736,10 @@
       <w:ind w:left="1100"/>
     </w:pPr>
   </w:style>
-  <w:style w:type="paragraph" w:styleId="195">
+  <w:style w:type="paragraph" w:styleId="880">
     <w:name w:val="toc 7"/>
-    <w:basedOn w:val="664"/>
-    <w:next w:val="664"/>
+    <w:basedOn w:val="886"/>
+    <w:next w:val="886"/>
     <w:uiPriority w:val="39"/>
     <w:unhideWhenUsed/>
     <w:pPr>
@@ -30679,10 +30748,10 @@
       <w:ind w:left="1320"/>
     </w:pPr>
   </w:style>
-  <w:style w:type="paragraph" w:styleId="196">
+  <w:style w:type="paragraph" w:styleId="881">
     <w:name w:val="toc 8"/>
-    <w:basedOn w:val="664"/>
-    <w:next w:val="664"/>
+    <w:basedOn w:val="886"/>
+    <w:next w:val="886"/>
     <w:uiPriority w:val="39"/>
     <w:unhideWhenUsed/>
     <w:pPr>
@@ -30691,10 +30760,10 @@
       <w:ind w:left="1540"/>
     </w:pPr>
   </w:style>
-  <w:style w:type="paragraph" w:styleId="197">
+  <w:style w:type="paragraph" w:styleId="882">
     <w:name w:val="toc 9"/>
-    <w:basedOn w:val="664"/>
-    <w:next w:val="664"/>
+    <w:basedOn w:val="886"/>
+    <w:next w:val="886"/>
     <w:uiPriority w:val="39"/>
     <w:unhideWhenUsed/>
     <w:pPr>
@@ -30703,9 +30772,9 @@
       <w:ind w:left="1760"/>
     </w:pPr>
   </w:style>
-  <w:style w:type="character" w:styleId="198">
+  <w:style w:type="character" w:styleId="883">
     <w:name w:val="Placeholder Text"/>
-    <w:basedOn w:val="148"/>
+    <w:basedOn w:val="836"/>
     <w:uiPriority w:val="99"/>
     <w:semiHidden/>
     <w:pPr>
@@ -30717,7 +30786,7 @@
       <w:color w:val="666666"/>
     </w:rPr>
   </w:style>
-  <w:style w:type="paragraph" w:styleId="208">
+  <w:style w:type="paragraph" w:styleId="884">
     <w:name w:val="TOC Heading"/>
     <w:uiPriority w:val="39"/>
     <w:unhideWhenUsed/>
@@ -30727,10 +30796,10 @@
       <w:ind/>
     </w:pPr>
   </w:style>
-  <w:style w:type="paragraph" w:styleId="209">
+  <w:style w:type="paragraph" w:styleId="885">
     <w:name w:val="table of figures"/>
-    <w:basedOn w:val="664"/>
-    <w:next w:val="664"/>
+    <w:basedOn w:val="886"/>
+    <w:next w:val="886"/>
     <w:uiPriority w:val="99"/>
     <w:unhideWhenUsed/>
     <w:pPr>
@@ -30739,7 +30808,7 @@
       <w:ind/>
     </w:pPr>
   </w:style>
-  <w:style w:type="paragraph" w:styleId="664" w:default="1">
+  <w:style w:type="paragraph" w:styleId="886" w:default="1">
     <w:name w:val="Normal"/>
     <w:qFormat/>
     <w:pPr>
@@ -30748,7 +30817,7 @@
       <w:ind/>
     </w:pPr>
   </w:style>
-  <w:style w:type="table" w:styleId="665" w:default="1">
+  <w:style w:type="table" w:styleId="887" w:default="1">
     <w:name w:val="Normal Table"/>
     <w:uiPriority w:val="99"/>
     <w:semiHidden/>
@@ -30941,7 +31010,7 @@
       </w:tcPr>
     </w:tblStylePr>
   </w:style>
-  <w:style w:type="numbering" w:styleId="666" w:default="1">
+  <w:style w:type="numbering" w:styleId="888" w:default="1">
     <w:name w:val="No List"/>
     <w:uiPriority w:val="99"/>
     <w:semiHidden/>
@@ -30952,9 +31021,9 @@
       <w:ind/>
     </w:pPr>
   </w:style>
-  <w:style w:type="paragraph" w:styleId="667">
+  <w:style w:type="paragraph" w:styleId="889">
     <w:name w:val="No Spacing"/>
-    <w:basedOn w:val="664"/>
+    <w:basedOn w:val="886"/>
     <w:uiPriority w:val="1"/>
     <w:qFormat/>
     <w:pPr>
@@ -30963,9 +31032,9 @@
       <w:ind/>
     </w:pPr>
   </w:style>
-  <w:style w:type="paragraph" w:styleId="668">
+  <w:style w:type="paragraph" w:styleId="890">
     <w:name w:val="List Paragraph"/>
-    <w:basedOn w:val="664"/>
+    <w:basedOn w:val="886"/>
     <w:uiPriority w:val="34"/>
     <w:qFormat/>
     <w:pPr>

</xml_diff>